<commit_message>
feat: Introduce new audit chain workflows, judge and panel agents, and documentation.
</commit_message>
<xml_diff>
--- a/docs/Holistinen Mestaruus luku 2.docx
+++ b/docs/Holistinen Mestaruus luku 2.docx
@@ -1266,7 +1266,55 @@
           <w:rFonts w:ascii="Google Sans Text" w:eastAsia="Google Sans Text" w:hAnsi="Google Sans Text" w:cs="Google Sans Text"/>
           <w:color w:val="1F1F1F"/>
         </w:rPr>
-        <w:t xml:space="preserve"> (2003) argumentaatiomallia päättelyn laadun systemaattiseen validointiin.</w:t>
+        <w:t xml:space="preserve"> (2003) argumentaatiomallia päättelyn laadun systemaattiseen validointiin. Tämä seuraa </w:t>
+      </w:r>
+      <w:proofErr w:type="spellStart"/>
+      <w:r>
+        <w:rPr>
+          <w:rFonts w:ascii="Google Sans Text" w:eastAsia="Google Sans Text" w:hAnsi="Google Sans Text" w:cs="Google Sans Text"/>
+          <w:color w:val="1F1F1F"/>
+        </w:rPr>
+        <w:t>Mislevyn</w:t>
+      </w:r>
+      <w:proofErr w:type="spellEnd"/>
+      <w:r>
+        <w:rPr>
+          <w:rFonts w:ascii="Google Sans Text" w:eastAsia="Google Sans Text" w:hAnsi="Google Sans Text" w:cs="Google Sans Text"/>
+          <w:color w:val="1F1F1F"/>
+        </w:rPr>
+        <w:t xml:space="preserve"> (2003) periaatetta arvioinnista todistusaineistoon perustuvana argumenttina, jossa tavoitteena ei ole vain väittely, vaan totuuden selvittäminen (</w:t>
+      </w:r>
+      <w:proofErr w:type="spellStart"/>
+      <w:r>
+        <w:rPr>
+          <w:rFonts w:ascii="Google Sans Text" w:eastAsia="Google Sans Text" w:hAnsi="Google Sans Text" w:cs="Google Sans Text"/>
+          <w:color w:val="1F1F1F"/>
+        </w:rPr>
+        <w:t>Crusius</w:t>
+      </w:r>
+      <w:proofErr w:type="spellEnd"/>
+      <w:r>
+        <w:rPr>
+          <w:rFonts w:ascii="Google Sans Text" w:eastAsia="Google Sans Text" w:hAnsi="Google Sans Text" w:cs="Google Sans Text"/>
+          <w:color w:val="1F1F1F"/>
+        </w:rPr>
+        <w:t xml:space="preserve"> &amp; </w:t>
+      </w:r>
+      <w:proofErr w:type="spellStart"/>
+      <w:r>
+        <w:rPr>
+          <w:rFonts w:ascii="Google Sans Text" w:eastAsia="Google Sans Text" w:hAnsi="Google Sans Text" w:cs="Google Sans Text"/>
+          <w:color w:val="1F1F1F"/>
+        </w:rPr>
+        <w:t>Channell</w:t>
+      </w:r>
+      <w:proofErr w:type="spellEnd"/>
+      <w:r>
+        <w:rPr>
+          <w:rFonts w:ascii="Google Sans Text" w:eastAsia="Google Sans Text" w:hAnsi="Google Sans Text" w:cs="Google Sans Text"/>
+          <w:color w:val="1F1F1F"/>
+        </w:rPr>
+        <w:t xml:space="preserve"> 2003).</w:t>
       </w:r>
       <w:r>
         <w:rPr>
@@ -1781,7 +1829,15 @@
                 <w:rFonts w:ascii="Google Sans Text" w:eastAsia="Google Sans Text" w:hAnsi="Google Sans Text" w:cs="Google Sans Text"/>
                 <w:color w:val="1F1F1F"/>
               </w:rPr>
-              <w:t xml:space="preserve"> Käyttäjä on purkanut ongelman osiin ja ohjannut tekoälyä ennaltaehkäisevästi. TAI Prosessi osoittaa poikkeuksellista ketteryyttä merkittävän oivalluksen kautta.</w:t>
+              <w:t xml:space="preserve"> Käyttäjä on purkanut ongelman osiin ja ohjannut tekoälyä ennaltaehkäisevästi. TAI Prosessi osoittaa poikkeuksellista ketteryyttä merkittävän </w:t>
+            </w:r>
+            <w:r>
+              <w:rPr>
+                <w:rFonts w:ascii="Google Sans Text" w:eastAsia="Google Sans Text" w:hAnsi="Google Sans Text" w:cs="Google Sans Text"/>
+                <w:color w:val="1F1F1F"/>
+              </w:rPr>
+              <w:lastRenderedPageBreak/>
+              <w:t>oivalluksen kautta.</w:t>
             </w:r>
           </w:p>
         </w:tc>
@@ -1819,6 +1875,7 @@
                 <w:bCs/>
                 <w:color w:val="1F1F1F"/>
               </w:rPr>
+              <w:lastRenderedPageBreak/>
               <w:t>Prosessi on tehokas.</w:t>
             </w:r>
             <w:r>
@@ -1959,17 +2016,7 @@
                 <w:bCs/>
                 <w:color w:val="1F1F1F"/>
               </w:rPr>
-              <w:t xml:space="preserve">Arviointi ja </w:t>
-            </w:r>
-            <w:r>
-              <w:rPr>
-                <w:rFonts w:ascii="Google Sans Text" w:eastAsia="Google Sans Text" w:hAnsi="Google Sans Text" w:cs="Google Sans Text"/>
-                <w:b/>
-                <w:bCs/>
-                <w:color w:val="1F1F1F"/>
-              </w:rPr>
-              <w:lastRenderedPageBreak/>
-              <w:t>Argumentaatio</w:t>
+              <w:t>Arviointi ja Argumentaatio</w:t>
             </w:r>
             <w:r>
               <w:rPr>
@@ -2062,18 +2109,7 @@
                 <w:bCs/>
                 <w:color w:val="1F1F1F"/>
               </w:rPr>
-              <w:lastRenderedPageBreak/>
-              <w:t xml:space="preserve">Poikkeuksellinen </w:t>
-            </w:r>
-            <w:r>
-              <w:rPr>
-                <w:rFonts w:ascii="Google Sans Text" w:eastAsia="Google Sans Text" w:hAnsi="Google Sans Text" w:cs="Google Sans Text"/>
-                <w:b/>
-                <w:bCs/>
-                <w:color w:val="1F1F1F"/>
-              </w:rPr>
-              <w:lastRenderedPageBreak/>
-              <w:t>arviointikyky.</w:t>
+              <w:t>Poikkeuksellinen arviointikyky.</w:t>
             </w:r>
             <w:r>
               <w:rPr>
@@ -2118,18 +2154,7 @@
                 <w:bCs/>
                 <w:color w:val="1F1F1F"/>
               </w:rPr>
-              <w:lastRenderedPageBreak/>
-              <w:t xml:space="preserve">Korkea </w:t>
-            </w:r>
-            <w:r>
-              <w:rPr>
-                <w:rFonts w:ascii="Google Sans Text" w:eastAsia="Google Sans Text" w:hAnsi="Google Sans Text" w:cs="Google Sans Text"/>
-                <w:b/>
-                <w:bCs/>
-                <w:color w:val="1F1F1F"/>
-              </w:rPr>
-              <w:lastRenderedPageBreak/>
-              <w:t>arviointikyky.</w:t>
+              <w:t>Korkea arviointikyky.</w:t>
             </w:r>
             <w:r>
               <w:rPr>
@@ -2174,18 +2199,7 @@
                 <w:bCs/>
                 <w:color w:val="1F1F1F"/>
               </w:rPr>
-              <w:lastRenderedPageBreak/>
-              <w:t xml:space="preserve">Perustason </w:t>
-            </w:r>
-            <w:r>
-              <w:rPr>
-                <w:rFonts w:ascii="Google Sans Text" w:eastAsia="Google Sans Text" w:hAnsi="Google Sans Text" w:cs="Google Sans Text"/>
-                <w:b/>
-                <w:bCs/>
-                <w:color w:val="1F1F1F"/>
-              </w:rPr>
-              <w:lastRenderedPageBreak/>
-              <w:t>arviointikyky.</w:t>
+              <w:t>Perustason arviointikyky.</w:t>
             </w:r>
             <w:r>
               <w:rPr>
@@ -2230,18 +2244,7 @@
                 <w:bCs/>
                 <w:color w:val="1F1F1F"/>
               </w:rPr>
-              <w:lastRenderedPageBreak/>
-              <w:t xml:space="preserve">Ei </w:t>
-            </w:r>
-            <w:r>
-              <w:rPr>
-                <w:rFonts w:ascii="Google Sans Text" w:eastAsia="Google Sans Text" w:hAnsi="Google Sans Text" w:cs="Google Sans Text"/>
-                <w:b/>
-                <w:bCs/>
-                <w:color w:val="1F1F1F"/>
-              </w:rPr>
-              <w:lastRenderedPageBreak/>
-              <w:t>arviointikykyä.</w:t>
+              <w:t>Ei arviointikykyä.</w:t>
             </w:r>
             <w:r>
               <w:rPr>
@@ -2291,7 +2294,6 @@
                 <w:bCs/>
                 <w:color w:val="1F1F1F"/>
               </w:rPr>
-              <w:lastRenderedPageBreak/>
               <w:t>Synteesi ja Luovuus</w:t>
             </w:r>
             <w:r>
@@ -2676,7 +2678,15 @@
           <w:rFonts w:ascii="Google Sans Text" w:eastAsia="Google Sans Text" w:hAnsi="Google Sans Text" w:cs="Google Sans Text"/>
           <w:color w:val="1F1F1F"/>
         </w:rPr>
-        <w:t xml:space="preserve"> engineering) laatu on muodostumassa uudeksi kriittiseksi perustaidoksi tekoälyavusteisessa tietotyössä</w:t>
+        <w:t xml:space="preserve"> engineering) laatu on muodostumassa </w:t>
+      </w:r>
+      <w:r>
+        <w:rPr>
+          <w:rFonts w:ascii="Google Sans Text" w:eastAsia="Google Sans Text" w:hAnsi="Google Sans Text" w:cs="Google Sans Text"/>
+          <w:color w:val="1F1F1F"/>
+        </w:rPr>
+        <w:lastRenderedPageBreak/>
+        <w:t>uudeksi kriittiseksi perustaidoksi tekoälyavusteisessa tietotyössä</w:t>
       </w:r>
       <w:r>
         <w:rPr>
@@ -2744,11 +2754,11 @@
         <w:tblLook w:val="04A0" w:firstRow="1" w:lastRow="0" w:firstColumn="1" w:lastColumn="0" w:noHBand="0" w:noVBand="1"/>
       </w:tblPr>
       <w:tblGrid>
-        <w:gridCol w:w="1491"/>
-        <w:gridCol w:w="2157"/>
-        <w:gridCol w:w="1879"/>
-        <w:gridCol w:w="1734"/>
-        <w:gridCol w:w="2083"/>
+        <w:gridCol w:w="1486"/>
+        <w:gridCol w:w="2122"/>
+        <w:gridCol w:w="1851"/>
+        <w:gridCol w:w="1706"/>
+        <w:gridCol w:w="2179"/>
       </w:tblGrid>
       <w:tr>
         <w:trPr>
@@ -2789,7 +2799,6 @@
                 <w:bCs/>
                 <w:color w:val="1F1F1F"/>
               </w:rPr>
-              <w:lastRenderedPageBreak/>
               <w:t>Kriteeri</w:t>
             </w:r>
           </w:p>
@@ -3260,7 +3269,62 @@
                 <w:rFonts w:ascii="Google Sans Text" w:eastAsia="Google Sans Text" w:hAnsi="Google Sans Text" w:cs="Google Sans Text"/>
                 <w:color w:val="1F1F1F"/>
               </w:rPr>
-              <w:t xml:space="preserve"> Passiivinen tilaaja. "Tee essee aiheesta X". Hyväksyy ensimmäisen version. Ulkoistaa ajattelun.</w:t>
+              <w:t xml:space="preserve"> Passiivinen tilaaja. "Tee essee aiheesta X". Hyväksyy ensimmäisen version. </w:t>
+            </w:r>
+            <w:r>
+              <w:rPr>
+                <w:rFonts w:ascii="Google Sans Text" w:eastAsia="Google Sans Text" w:hAnsi="Google Sans Text" w:cs="Google Sans Text"/>
+                <w:color w:val="1F1F1F"/>
+              </w:rPr>
+              <w:t>Ulkoistaa ajattelun noudattaen "</w:t>
+            </w:r>
+            <w:proofErr w:type="spellStart"/>
+            <w:r>
+              <w:rPr>
+                <w:rFonts w:ascii="Google Sans Text" w:eastAsia="Google Sans Text" w:hAnsi="Google Sans Text" w:cs="Google Sans Text"/>
+                <w:color w:val="1F1F1F"/>
+              </w:rPr>
+              <w:t>Lazy</w:t>
+            </w:r>
+            <w:proofErr w:type="spellEnd"/>
+            <w:r>
+              <w:rPr>
+                <w:rFonts w:ascii="Google Sans Text" w:eastAsia="Google Sans Text" w:hAnsi="Google Sans Text" w:cs="Google Sans Text"/>
+                <w:color w:val="1F1F1F"/>
+              </w:rPr>
+              <w:t xml:space="preserve"> User </w:t>
+            </w:r>
+            <w:proofErr w:type="spellStart"/>
+            <w:r>
+              <w:rPr>
+                <w:rFonts w:ascii="Google Sans Text" w:eastAsia="Google Sans Text" w:hAnsi="Google Sans Text" w:cs="Google Sans Text"/>
+                <w:color w:val="1F1F1F"/>
+              </w:rPr>
+              <w:t>Theory</w:t>
+            </w:r>
+            <w:proofErr w:type="spellEnd"/>
+            <w:r>
+              <w:rPr>
+                <w:rFonts w:ascii="Google Sans Text" w:eastAsia="Google Sans Text" w:hAnsi="Google Sans Text" w:cs="Google Sans Text"/>
+                <w:color w:val="1F1F1F"/>
+              </w:rPr>
+              <w:t>" -mallin mukaista minimiponnistelun periaatetta (</w:t>
+            </w:r>
+            <w:proofErr w:type="spellStart"/>
+            <w:r>
+              <w:rPr>
+                <w:rFonts w:ascii="Google Sans Text" w:eastAsia="Google Sans Text" w:hAnsi="Google Sans Text" w:cs="Google Sans Text"/>
+                <w:color w:val="1F1F1F"/>
+              </w:rPr>
+              <w:t>Tétard</w:t>
+            </w:r>
+            <w:proofErr w:type="spellEnd"/>
+            <w:r>
+              <w:rPr>
+                <w:rFonts w:ascii="Google Sans Text" w:eastAsia="Google Sans Text" w:hAnsi="Google Sans Text" w:cs="Google Sans Text"/>
+                <w:color w:val="1F1F1F"/>
+              </w:rPr>
+              <w:t xml:space="preserve"> &amp; Collan 2009).</w:t>
             </w:r>
           </w:p>
         </w:tc>
@@ -3919,6 +3983,7 @@
           <w:rFonts w:ascii="Google Sans Text" w:eastAsia="Google Sans Text" w:hAnsi="Google Sans Text" w:cs="Google Sans Text"/>
           <w:color w:val="1F1F1F"/>
         </w:rPr>
+        <w:lastRenderedPageBreak/>
         <w:t xml:space="preserve">Näiden kahden ulottuvuuden suhde on kriittinen "Mittaamisen paradoksin" ratkaisemiseksi. </w:t>
       </w:r>
       <w:r>
@@ -4084,7 +4149,6 @@
           <w:rFonts w:ascii="Google Sans Text" w:eastAsia="Google Sans Text" w:hAnsi="Google Sans Text" w:cs="Google Sans Text"/>
           <w:color w:val="1F1F1F"/>
         </w:rPr>
-        <w:lastRenderedPageBreak/>
         <w:t>Yhdistämällä nämä tasot hybridirubriikki kykenee erottamaan aidon asiantuntijuuden (korkea kognitiivinen taso + aktiivinen strateginen ohjaus) näennäisosaamisesta (korkea kognitiivinen taso + passiivinen rooli).</w:t>
       </w:r>
     </w:p>
@@ -4894,7 +4958,15 @@
           <w:rFonts w:ascii="Google Sans Text" w:eastAsia="Google Sans Text" w:hAnsi="Google Sans Text" w:cs="Google Sans Text"/>
           <w:color w:val="1F1F1F"/>
         </w:rPr>
-        <w:t xml:space="preserve"> ym. 1980), ja eräissä vertailuissa ne ovat jopa osoittaneet heikompaa arvioitsijoiden välistä yhdenmukaisuutta kuin perinteiset summatiiviset asteikot (</w:t>
+        <w:t xml:space="preserve"> ym. 1980), ja eräissä vertailuissa ne ovat jopa osoittaneet heikompaa arvioitsijoiden välistä yhdenmukaisuutta kuin perinteiset </w:t>
+      </w:r>
+      <w:r>
+        <w:rPr>
+          <w:rFonts w:ascii="Google Sans Text" w:eastAsia="Google Sans Text" w:hAnsi="Google Sans Text" w:cs="Google Sans Text"/>
+          <w:color w:val="1F1F1F"/>
+        </w:rPr>
+        <w:lastRenderedPageBreak/>
+        <w:t>summatiiviset asteikot (</w:t>
       </w:r>
       <w:proofErr w:type="spellStart"/>
       <w:r>
@@ -4965,15 +5037,7 @@
           <w:rFonts w:ascii="Google Sans Text" w:eastAsia="Google Sans Text" w:hAnsi="Google Sans Text" w:cs="Google Sans Text"/>
           <w:color w:val="1F1F1F"/>
         </w:rPr>
-        <w:t xml:space="preserve"> ym. 2018), kuten ongelmanratkaisua ja </w:t>
-      </w:r>
-      <w:r>
-        <w:rPr>
-          <w:rFonts w:ascii="Google Sans Text" w:eastAsia="Google Sans Text" w:hAnsi="Google Sans Text" w:cs="Google Sans Text"/>
-          <w:color w:val="1F1F1F"/>
-        </w:rPr>
-        <w:lastRenderedPageBreak/>
-        <w:t xml:space="preserve">luovuutta, joita on vaikea kuvata spesifisinä, havaittavina käyttäytymisinä. Juuri tämä BARS-mallien ankkureiden "äärimmäinen spesifisyys" (engl. </w:t>
+        <w:t xml:space="preserve"> ym. 2018), kuten ongelmanratkaisua ja luovuutta, joita on vaikea kuvata spesifisinä, havaittavina käyttäytymisinä. Juuri tämä BARS-mallien ankkureiden "äärimmäinen spesifisyys" (engl. </w:t>
       </w:r>
       <w:proofErr w:type="spellStart"/>
       <w:r>
@@ -5348,7 +5412,15 @@
           <w:rFonts w:ascii="Google Sans Text" w:eastAsia="Google Sans Text" w:hAnsi="Google Sans Text" w:cs="Google Sans Text"/>
           <w:color w:val="1F1F1F"/>
         </w:rPr>
-        <w:t xml:space="preserve"> arkkitehtuuri on suunniteltu hallitsemaan tätä lisääntynyttä jännitettä. Analyytikko-agentti ankkuroi väitteet todistusaineistoon (Luku 2.3.3), Loogikko-agentti purkaa argumentin rakenteen (Luku 2.3.4) ja Kriitikkoryhmä falsifioi argumentin (Luku 2.3.5). Tämän prosessin tavoitteena on varmistaa, että monimutkaisten kriteerien soveltaminen pysyy ankkuroituna objektiiviseen todistusaineistoon, mikä vähentää subjektiivista tulkintaa ja tukee luotettavuutta.</w:t>
+        <w:t xml:space="preserve"> arkkitehtuuri on suunniteltu hallitsemaan tätä lisääntynyttä jännitettä. Analyytikko-agentti ankkuroi väitteet todistusaineistoon (Luku 2.3.3), Loogikko-agentti purkaa argumentin rakenteen (Luku 2.3.4) ja Kriitikkoryhmä falsifioi </w:t>
+      </w:r>
+      <w:r>
+        <w:rPr>
+          <w:rFonts w:ascii="Google Sans Text" w:eastAsia="Google Sans Text" w:hAnsi="Google Sans Text" w:cs="Google Sans Text"/>
+          <w:color w:val="1F1F1F"/>
+        </w:rPr>
+        <w:lastRenderedPageBreak/>
+        <w:t>argumentin (Luku 2.3.5). Tämän prosessin tavoitteena on varmistaa, että monimutkaisten kriteerien soveltaminen pysyy ankkuroituna objektiiviseen todistusaineistoon, mikä vähentää subjektiivista tulkintaa ja tukee luotettavuutta.</w:t>
       </w:r>
     </w:p>
     <w:p>
@@ -5387,15 +5459,7 @@
           <w:rFonts w:ascii="Google Sans Text" w:eastAsia="Google Sans Text" w:hAnsi="Google Sans Text" w:cs="Google Sans Text"/>
           <w:color w:val="1F1F1F"/>
         </w:rPr>
-        <w:t xml:space="preserve">Hybridirubriikin toinen arkkitehtoninen taso on sen holistinen taso. Se on suunniteltu nimenomaan kompensoimaan analyyttisen tason jäykkyyttä ja ratkaisemaan pätevyyteen </w:t>
-      </w:r>
-      <w:r>
-        <w:rPr>
-          <w:rFonts w:ascii="Google Sans Text" w:eastAsia="Google Sans Text" w:hAnsi="Google Sans Text" w:cs="Google Sans Text"/>
-          <w:color w:val="1F1F1F"/>
-        </w:rPr>
-        <w:lastRenderedPageBreak/>
-        <w:t>liittyvä haaste. Sen tehtävänä on tunnistaa aito asiantuntijuus, joka usein ylittää tai jopa tietoisesti rikkoo ennalta määriteltyjä sääntöjä paremman lopputuloksen saavuttamiseksi.</w:t>
+        <w:t>Hybridirubriikin toinen arkkitehtoninen taso on sen holistinen taso. Se on suunniteltu nimenomaan kompensoimaan analyyttisen tason jäykkyyttä ja ratkaisemaan pätevyyteen liittyvä haaste. Sen tehtävänä on tunnistaa aito asiantuntijuus, joka usein ylittää tai jopa tietoisesti rikkoo ennalta määriteltyjä sääntöjä paremman lopputuloksen saavuttamiseksi.</w:t>
       </w:r>
     </w:p>
     <w:p>
@@ -5986,6 +6050,7 @@
           <w:bCs/>
           <w:color w:val="1F1F1F"/>
         </w:rPr>
+        <w:lastRenderedPageBreak/>
         <w:t>Synteesi ja Raportointi:</w:t>
       </w:r>
       <w:r>
@@ -6085,7 +6150,6 @@
           <w:rFonts w:ascii="Google Sans Text" w:eastAsia="Google Sans Text" w:hAnsi="Google Sans Text" w:cs="Google Sans Text"/>
           <w:color w:val="1F1F1F"/>
         </w:rPr>
-        <w:lastRenderedPageBreak/>
         <w:t>Tämän moniagenttijärjestelmän täydellinen operationaalinen komentorakenne, agenttien roolit ja vaiheittainen työnkulku muodostavat sen operatiivisen mallin.</w:t>
       </w:r>
     </w:p>
@@ -6396,7 +6460,15 @@
           <w:rFonts w:ascii="Google Sans Text" w:eastAsia="Google Sans Text" w:hAnsi="Google Sans Text" w:cs="Google Sans Text"/>
           <w:color w:val="1F1F1F"/>
         </w:rPr>
-        <w:t xml:space="preserve"> Prosessi alkaa todistusaineiston keräämisestä ja ankkuroinnista (Analyytikko-agentti, ks. Luku 2.3.3).</w:t>
+        <w:t xml:space="preserve"> Prosessi alkaa todistusaineiston keräämisestä ja </w:t>
+      </w:r>
+      <w:r>
+        <w:rPr>
+          <w:rFonts w:ascii="Google Sans Text" w:eastAsia="Google Sans Text" w:hAnsi="Google Sans Text" w:cs="Google Sans Text"/>
+          <w:color w:val="1F1F1F"/>
+        </w:rPr>
+        <w:lastRenderedPageBreak/>
+        <w:t>ankkuroinnista (Analyytikko-agentti, ks. Luku 2.3.3).</w:t>
       </w:r>
     </w:p>
     <w:p>
@@ -6563,7 +6635,6 @@
           <w:rFonts w:ascii="Google Sans Text" w:eastAsia="Google Sans Text" w:hAnsi="Google Sans Text" w:cs="Google Sans Text"/>
           <w:color w:val="1F1F1F"/>
         </w:rPr>
-        <w:lastRenderedPageBreak/>
         <w:t xml:space="preserve">Tämä vaiheittainen malli on tietoinen arkkitehtuurivalinta, joka priorisoi maksimaalista auditoitavuutta ja jäljitettävyyttä tehokkuuden kustannuksella. Vaikka dynaamisemmat debatti-arkkitehtuurit voivat tuottaa syvällisempiä oivalluksia (Du ym. 2023), tämä tiukasti </w:t>
       </w:r>
       <w:proofErr w:type="spellStart"/>
@@ -6679,14 +6750,19 @@
           <w:rFonts w:ascii="Google Sans Text" w:eastAsia="Google Sans Text" w:hAnsi="Google Sans Text" w:cs="Google Sans Text"/>
           <w:color w:val="1F1F1F"/>
         </w:rPr>
-        <w:t xml:space="preserve"> ja Aktiivinen Uhkien Luokittelu. Sen tehtävänä on torjua ulkoisia uhkia, kuten kehotemurtoja (LLM01:2025). Torjunta kohdistuu erityisesti epäsuoriin kehotemurtoihin (engl. </w:t>
-      </w:r>
-      <w:proofErr w:type="spellStart"/>
-      <w:r>
-        <w:rPr>
-          <w:rFonts w:ascii="Google Sans Text" w:eastAsia="Google Sans Text" w:hAnsi="Google Sans Text" w:cs="Google Sans Text"/>
-          <w:i/>
-          <w:iCs/>
+        <w:t xml:space="preserve"> ja Aktiivinen Uhkien Luokittelu. Sen tehtävänä on torjua ulkoisia uhkia, kuten kehotemurtoja (LLM01:2025). </w:t>
+      </w:r>
+      <w:r>
+        <w:rPr>
+          <w:rFonts w:ascii="Google Sans Text" w:eastAsia="Google Sans Text" w:hAnsi="Google Sans Text" w:cs="Google Sans Text"/>
+          <w:color w:val="1F1F1F"/>
+        </w:rPr>
+        <w:t xml:space="preserve">Torjunta kohdistuu erityisesti epäsuoriin kehotemurtoihin (engl. </w:t>
+      </w:r>
+      <w:proofErr w:type="spellStart"/>
+      <w:r>
+        <w:rPr>
+          <w:rFonts w:ascii="Google Sans Text" w:eastAsia="Google Sans Text" w:hAnsi="Google Sans Text" w:cs="Google Sans Text"/>
           <w:color w:val="1F1F1F"/>
         </w:rPr>
         <w:t>Indirect</w:t>
@@ -6695,8 +6771,6 @@
       <w:r>
         <w:rPr>
           <w:rFonts w:ascii="Google Sans Text" w:eastAsia="Google Sans Text" w:hAnsi="Google Sans Text" w:cs="Google Sans Text"/>
-          <w:i/>
-          <w:iCs/>
           <w:color w:val="1F1F1F"/>
         </w:rPr>
         <w:t xml:space="preserve"> </w:t>
@@ -6705,8 +6779,6 @@
       <w:r>
         <w:rPr>
           <w:rFonts w:ascii="Google Sans Text" w:eastAsia="Google Sans Text" w:hAnsi="Google Sans Text" w:cs="Google Sans Text"/>
-          <w:i/>
-          <w:iCs/>
           <w:color w:val="1F1F1F"/>
         </w:rPr>
         <w:t>Prompt</w:t>
@@ -6715,8 +6787,6 @@
       <w:r>
         <w:rPr>
           <w:rFonts w:ascii="Google Sans Text" w:eastAsia="Google Sans Text" w:hAnsi="Google Sans Text" w:cs="Google Sans Text"/>
-          <w:i/>
-          <w:iCs/>
           <w:color w:val="1F1F1F"/>
         </w:rPr>
         <w:t xml:space="preserve"> </w:t>
@@ -6725,8 +6795,6 @@
       <w:r>
         <w:rPr>
           <w:rFonts w:ascii="Google Sans Text" w:eastAsia="Google Sans Text" w:hAnsi="Google Sans Text" w:cs="Google Sans Text"/>
-          <w:i/>
-          <w:iCs/>
           <w:color w:val="1F1F1F"/>
         </w:rPr>
         <w:t>Injection</w:t>
@@ -6753,7 +6821,23 @@
           <w:rFonts w:ascii="Google Sans Text" w:eastAsia="Google Sans Text" w:hAnsi="Google Sans Text" w:cs="Google Sans Text"/>
           <w:color w:val="1F1F1F"/>
         </w:rPr>
-        <w:t xml:space="preserve"> ym. 2023; Liu, X. ym. 2024).</w:t>
+        <w:t xml:space="preserve"> ym. 2023; Liu, Yi ym. 2023; Liu, X. ym. 2024) sekä autonomisten agenttien erityisuhkiin (</w:t>
+      </w:r>
+      <w:proofErr w:type="spellStart"/>
+      <w:r>
+        <w:rPr>
+          <w:rFonts w:ascii="Google Sans Text" w:eastAsia="Google Sans Text" w:hAnsi="Google Sans Text" w:cs="Google Sans Text"/>
+          <w:color w:val="1F1F1F"/>
+        </w:rPr>
+        <w:t>AIMultiple</w:t>
+      </w:r>
+      <w:proofErr w:type="spellEnd"/>
+      <w:r>
+        <w:rPr>
+          <w:rFonts w:ascii="Google Sans Text" w:eastAsia="Google Sans Text" w:hAnsi="Google Sans Text" w:cs="Google Sans Text"/>
+          <w:color w:val="1F1F1F"/>
+        </w:rPr>
+        <w:t xml:space="preserve"> 2025).</w:t>
       </w:r>
     </w:p>
     <w:p>
@@ -6872,6 +6956,7 @@
           <w:rFonts w:ascii="Google Sans Text" w:eastAsia="Google Sans Text" w:hAnsi="Google Sans Text" w:cs="Google Sans Text"/>
           <w:color w:val="1F1F1F"/>
         </w:rPr>
+        <w:lastRenderedPageBreak/>
         <w:t xml:space="preserve">Analyytikko-agentti aloittaa analyysivaiheen luomalla ”todistuskartan”, joka perustuu </w:t>
       </w:r>
       <w:proofErr w:type="spellStart"/>
@@ -7020,15 +7105,7 @@
           <w:rFonts w:ascii="Google Sans Text" w:eastAsia="Google Sans Text" w:hAnsi="Google Sans Text" w:cs="Google Sans Text"/>
           <w:color w:val="1F1F1F"/>
         </w:rPr>
-        <w:t xml:space="preserve">” -ilmiö, jossa mallit eivät kykene hyödyntämään tehokkaasti </w:t>
-      </w:r>
-      <w:r>
-        <w:rPr>
-          <w:rFonts w:ascii="Google Sans Text" w:eastAsia="Google Sans Text" w:hAnsi="Google Sans Text" w:cs="Google Sans Text"/>
-          <w:color w:val="1F1F1F"/>
-        </w:rPr>
-        <w:lastRenderedPageBreak/>
-        <w:t>tietoa pitkän konteksti-ikkunan keskellä (Liu, N. F. ym. 2024). Prototyyppivaiheessa tätä riskiä ei hallita teknisesti (esim. erillisellä uudelleensijoitusmallilla; vrt. Ma ym. 2024). Riskiä pyritään kuitenkin lieventämään operatiivisesti. Analyytikko-agentti on ohjeistettu toteuttamaan kaksivaiheisen prosessin: ensin agentti suorittaa laajan haun, minkä jälkeen se optimoi tulokset sijoittamalla tärkeimmät tulokset kontekstin alkuun ja loppuun. Tämä on kehotepohjainen strategia, joka perustuu Liu, N. F. ym. (2024) havaintoihin. Lisäksi agenttia ohjeistetaan kirjaamaan tämä riski XAI-raportointia varten.</w:t>
+        <w:t>” -ilmiö, jossa mallit eivät kykene hyödyntämään tehokkaasti tietoa pitkän konteksti-ikkunan keskellä (Liu, N. F. ym. 2024). Prototyyppivaiheessa tätä riskiä ei hallita teknisesti (esim. erillisellä uudelleensijoitusmallilla; vrt. Ma ym. 2024). Riskiä pyritään kuitenkin lieventämään operatiivisesti. Analyytikko-agentti on ohjeistettu toteuttamaan kaksivaiheisen prosessin: ensin agentti suorittaa laajan haun, minkä jälkeen se optimoi tulokset sijoittamalla tärkeimmät tulokset kontekstin alkuun ja loppuun. Tämä on kehotepohjainen strategia, joka perustuu Liu, N. F. ym. (2024) havaintoihin. Lisäksi agenttia ohjeistetaan kirjaamaan tämä riski XAI-raportointia varten.</w:t>
       </w:r>
     </w:p>
     <w:p>
@@ -7253,7 +7330,15 @@
           <w:rFonts w:ascii="Google Sans Text" w:eastAsia="Google Sans Text" w:hAnsi="Google Sans Text" w:cs="Google Sans Text"/>
           <w:color w:val="1F1F1F"/>
         </w:rPr>
-        <w:t xml:space="preserve">Sen sijaan, että ryhmä etsisi vahvistusta Loogikko-agentin havainnoille, sen tehtävä on yrittää aktiivisesti kumota Loogikko-agentin muodostama argumentti. Tämä on kriittinen vaihe, sillä ilman aktiivista haastamista tekoälymallit sortuvat helposti ”myötäilyvinoumaan” (engl. </w:t>
+        <w:t xml:space="preserve">Sen sijaan, että ryhmä etsisi vahvistusta Loogikko-agentin havainnoille, sen tehtävä on yrittää aktiivisesti kumota Loogikko-agentin muodostama argumentti. Tämä on kriittinen vaihe, sillä </w:t>
+      </w:r>
+      <w:r>
+        <w:rPr>
+          <w:rFonts w:ascii="Google Sans Text" w:eastAsia="Google Sans Text" w:hAnsi="Google Sans Text" w:cs="Google Sans Text"/>
+          <w:color w:val="1F1F1F"/>
+        </w:rPr>
+        <w:lastRenderedPageBreak/>
+        <w:t xml:space="preserve">ilman aktiivista haastamista tekoälymallit sortuvat helposti ”myötäilyvinoumaan” (engl. </w:t>
       </w:r>
       <w:proofErr w:type="spellStart"/>
       <w:r>
@@ -7375,7 +7460,6 @@
           <w:bCs/>
           <w:color w:val="1F1F1F"/>
         </w:rPr>
-        <w:lastRenderedPageBreak/>
         <w:t>Tehtävä:</w:t>
       </w:r>
       <w:r>
@@ -7431,14 +7515,19 @@
           <w:rFonts w:ascii="Google Sans Text" w:eastAsia="Google Sans Text" w:hAnsi="Google Sans Text" w:cs="Google Sans Text"/>
           <w:color w:val="1F1F1F"/>
         </w:rPr>
-        <w:t xml:space="preserve"> 2025). Se ei saa muuttaa analyysiaan vain ollakseen samaa mieltä muiden kanssa. Tätä varten se hyödyntää "punaisen tiimin" (engl. </w:t>
-      </w:r>
-      <w:proofErr w:type="spellStart"/>
-      <w:r>
-        <w:rPr>
-          <w:rFonts w:ascii="Google Sans Text" w:eastAsia="Google Sans Text" w:hAnsi="Google Sans Text" w:cs="Google Sans Text"/>
-          <w:i/>
-          <w:iCs/>
+        <w:t xml:space="preserve"> 2025). Se ei saa muuttaa analyysiaan vain ollakseen samaa mieltä muiden kanssa. </w:t>
+      </w:r>
+      <w:r>
+        <w:rPr>
+          <w:rFonts w:ascii="Google Sans Text" w:eastAsia="Google Sans Text" w:hAnsi="Google Sans Text" w:cs="Google Sans Text"/>
+          <w:color w:val="1F1F1F"/>
+        </w:rPr>
+        <w:t xml:space="preserve">Tätä varten se hyödyntää "punaisen tiimin" (engl. </w:t>
+      </w:r>
+      <w:proofErr w:type="spellStart"/>
+      <w:r>
+        <w:rPr>
+          <w:rFonts w:ascii="Google Sans Text" w:eastAsia="Google Sans Text" w:hAnsi="Google Sans Text" w:cs="Google Sans Text"/>
           <w:color w:val="1F1F1F"/>
         </w:rPr>
         <w:t>red</w:t>
@@ -7447,8 +7536,6 @@
       <w:r>
         <w:rPr>
           <w:rFonts w:ascii="Google Sans Text" w:eastAsia="Google Sans Text" w:hAnsi="Google Sans Text" w:cs="Google Sans Text"/>
-          <w:i/>
-          <w:iCs/>
           <w:color w:val="1F1F1F"/>
         </w:rPr>
         <w:t xml:space="preserve"> </w:t>
@@ -7457,8 +7544,6 @@
       <w:r>
         <w:rPr>
           <w:rFonts w:ascii="Google Sans Text" w:eastAsia="Google Sans Text" w:hAnsi="Google Sans Text" w:cs="Google Sans Text"/>
-          <w:i/>
-          <w:iCs/>
           <w:color w:val="1F1F1F"/>
         </w:rPr>
         <w:t>teaming</w:t>
@@ -7469,7 +7554,7 @@
           <w:rFonts w:ascii="Google Sans Text" w:eastAsia="Google Sans Text" w:hAnsi="Google Sans Text" w:cs="Google Sans Text"/>
           <w:color w:val="1F1F1F"/>
         </w:rPr>
-        <w:t>) menetelmiä (</w:t>
+        <w:t xml:space="preserve">) menetelmiä löytääkseen haitallisia käytösmalleja (Perez ym. 2022a; </w:t>
       </w:r>
       <w:proofErr w:type="spellStart"/>
       <w:r>
@@ -8093,7 +8178,15 @@
           <w:rFonts w:ascii="Google Sans Text" w:eastAsia="Google Sans Text" w:hAnsi="Google Sans Text" w:cs="Google Sans Text"/>
           <w:color w:val="1F1F1F"/>
         </w:rPr>
-        <w:t xml:space="preserve"> Agentti kuvittelee ideaalin dokumentin, joka kumoaisi väitteen, ja käyttää sitä hakuna (</w:t>
+        <w:t xml:space="preserve"> Agentti kuvittelee ideaalin </w:t>
+      </w:r>
+      <w:r>
+        <w:rPr>
+          <w:rFonts w:ascii="Google Sans Text" w:eastAsia="Google Sans Text" w:hAnsi="Google Sans Text" w:cs="Google Sans Text"/>
+          <w:color w:val="1F1F1F"/>
+        </w:rPr>
+        <w:lastRenderedPageBreak/>
+        <w:t>dokumentin, joka kumoaisi väitteen, ja käyttää sitä hakuna (</w:t>
       </w:r>
       <w:proofErr w:type="spellStart"/>
       <w:r>
@@ -8301,15 +8394,7 @@
           <w:rFonts w:ascii="Google Sans Text" w:eastAsia="Google Sans Text" w:hAnsi="Google Sans Text" w:cs="Google Sans Text"/>
           <w:color w:val="1F1F1F"/>
         </w:rPr>
-        <w:t xml:space="preserve">Osana Faktuaalisen ja Eettisen Valvoja-agentin toimintaa, järjestelmä toteuttaa </w:t>
-      </w:r>
-      <w:r>
-        <w:rPr>
-          <w:rFonts w:ascii="Google Sans Text" w:eastAsia="Google Sans Text" w:hAnsi="Google Sans Text" w:cs="Google Sans Text"/>
-          <w:color w:val="1F1F1F"/>
-        </w:rPr>
-        <w:lastRenderedPageBreak/>
-        <w:t>automatisoidun "Faktuaalisen Verifiointiprotokollan".</w:t>
+        <w:t>Osana Faktuaalisen ja Eettisen Valvoja-agentin toimintaa, järjestelmä toteuttaa automatisoidun "Faktuaalisen Verifiointiprotokollan".</w:t>
       </w:r>
       <w:r>
         <w:rPr>
@@ -8974,6 +9059,7 @@
           <w:rFonts w:ascii="Google Sans Text" w:eastAsia="Google Sans Text" w:hAnsi="Google Sans Text" w:cs="Google Sans Text"/>
           <w:color w:val="1F1F1F"/>
         </w:rPr>
+        <w:lastRenderedPageBreak/>
         <w:t>Verifiointitulos: Ristiriita / Vahvistus.</w:t>
       </w:r>
     </w:p>
@@ -9098,15 +9184,7 @@
           <w:rFonts w:ascii="Google Sans Text" w:eastAsia="Google Sans Text" w:hAnsi="Google Sans Text" w:cs="Google Sans Text"/>
           <w:color w:val="1F1F1F"/>
         </w:rPr>
-        <w:t xml:space="preserve"> Agentti tarkistaa aikajanan: ilmestyikö oivallus (syy) </w:t>
-      </w:r>
-      <w:r>
-        <w:rPr>
-          <w:rFonts w:ascii="Google Sans Text" w:eastAsia="Google Sans Text" w:hAnsi="Google Sans Text" w:cs="Google Sans Text"/>
-          <w:color w:val="1F1F1F"/>
-        </w:rPr>
-        <w:lastRenderedPageBreak/>
-        <w:t xml:space="preserve">keskusteluhistoriaan ennen tuloksen paranemista (seuraus)? Syyn on aina edellettävä seurausta (Hume 1739; </w:t>
+        <w:t xml:space="preserve"> Agentti tarkistaa aikajanan: ilmestyikö oivallus (syy) keskusteluhistoriaan ennen tuloksen paranemista (seuraus)? Syyn on aina edellettävä seurausta (Hume 1739; </w:t>
       </w:r>
       <w:proofErr w:type="spellStart"/>
       <w:r>
@@ -9707,6 +9785,7 @@
           <w:bCs/>
           <w:color w:val="1F1F1F"/>
         </w:rPr>
+        <w:lastRenderedPageBreak/>
         <w:t>Itsetehostuksen Indikaattorit:</w:t>
       </w:r>
       <w:r>
@@ -9862,15 +9941,7 @@
           <w:rFonts w:ascii="Google Sans Text" w:eastAsia="Google Sans Text" w:hAnsi="Google Sans Text" w:cs="Google Sans Text"/>
           <w:color w:val="1F1F1F"/>
         </w:rPr>
-        <w:t xml:space="preserve">On kuitenkin huomattava, että ilman ulkoista maailmanmallia kielimalli ei kykene muodolliseen </w:t>
-      </w:r>
-      <w:r>
-        <w:rPr>
-          <w:rFonts w:ascii="Google Sans Text" w:eastAsia="Google Sans Text" w:hAnsi="Google Sans Text" w:cs="Google Sans Text"/>
-          <w:color w:val="1F1F1F"/>
-        </w:rPr>
-        <w:lastRenderedPageBreak/>
-        <w:t>kausaaliseen päättelyyn (Chi ym. 2024), joten näiden agenttien (Kausaalinen Analyytikko-agentti ja Performatiivisuuden Tunnistaja-agentti) suorittamat testit mittaavat ensisijaisesti narratiivin loogista eheyttä eivätkä sen empiiristä totuusarvoa. Siksi nämä testit ovat "kielellisiä approksimaatioita" – ne ovat parhaita mahdollisia arvauksia, eivät matemaattisen tarkkoja todisteita. Tämä tekee järjestelmästä haavoittuvan taitavalle manipuloinnille.</w:t>
+        <w:t>On kuitenkin huomattava, että ilman ulkoista maailmanmallia kielimalli ei kykene muodolliseen kausaaliseen päättelyyn (Chi ym. 2024), joten näiden agenttien (Kausaalinen Analyytikko-agentti ja Performatiivisuuden Tunnistaja-agentti) suorittamat testit mittaavat ensisijaisesti narratiivin loogista eheyttä eivätkä sen empiiristä totuusarvoa. Siksi nämä testit ovat "kielellisiä approksimaatioita" – ne ovat parhaita mahdollisia arvauksia, eivät matemaattisen tarkkoja todisteita. Tämä tekee järjestelmästä haavoittuvan taitavalle manipuloinnille.</w:t>
       </w:r>
     </w:p>
     <w:p>
@@ -10327,7 +10398,15 @@
           <w:rFonts w:ascii="Google Sans Text" w:eastAsia="Google Sans Text" w:hAnsi="Google Sans Text" w:cs="Google Sans Text"/>
           <w:color w:val="1F1F1F"/>
         </w:rPr>
-        <w:t>). Mikäli järjestelmä ei pysty varmentamaan arkkitehtuurin eheyttä (esim. heterogeenisyyden puute; ks. Luku 2.4.2.4, Vaatimus 1), luotettavuusaste laskee automaattisesti tasolle "EHDOLLEINEN", mikä signaloi ihmisvalvojalle pakollista tarkistustarvetta noudattaen Protokollaa 4 (ks. Luku 2.4.3.3).</w:t>
+        <w:t xml:space="preserve">). Mikäli järjestelmä ei pysty varmentamaan arkkitehtuurin eheyttä (esim. heterogeenisyyden </w:t>
+      </w:r>
+      <w:r>
+        <w:rPr>
+          <w:rFonts w:ascii="Google Sans Text" w:eastAsia="Google Sans Text" w:hAnsi="Google Sans Text" w:cs="Google Sans Text"/>
+          <w:color w:val="1F1F1F"/>
+        </w:rPr>
+        <w:lastRenderedPageBreak/>
+        <w:t>puute; ks. Luku 2.4.2.4, Vaatimus 1), luotettavuusaste laskee automaattisesti tasolle "EHDOLLEINEN", mikä signaloi ihmisvalvojalle pakollista tarkistustarvetta noudattaen Protokollaa 4 (ks. Luku 2.4.3.3).</w:t>
       </w:r>
     </w:p>
     <w:p>
@@ -10428,7 +10507,6 @@
           <w:rFonts w:ascii="Google Sans Text" w:eastAsia="Google Sans Text" w:hAnsi="Google Sans Text" w:cs="Google Sans Text"/>
           <w:color w:val="1F1F1F"/>
         </w:rPr>
-        <w:lastRenderedPageBreak/>
         <w:t xml:space="preserve">Tämän lisäksi Tuomari-agentin päätöksentekoa ohjaa kooditasolle rakennettu deterministinen rangaistusmekanismi (engl. </w:t>
       </w:r>
       <w:proofErr w:type="spellStart"/>
@@ -10925,6 +11003,7 @@
           <w:bCs/>
           <w:color w:val="1F1F1F"/>
         </w:rPr>
+        <w:lastRenderedPageBreak/>
         <w:t>Kontekstuaalinen haku:</w:t>
       </w:r>
       <w:r>
@@ -11387,6 +11466,7 @@
         <w:pStyle w:val="Otsikko4"/>
       </w:pPr>
       <w:r>
+        <w:lastRenderedPageBreak/>
         <w:t>2.4.2 Tekninen Kontrollikerros</w:t>
       </w:r>
     </w:p>
@@ -11527,15 +11607,7 @@
           <w:rFonts w:ascii="Google Sans Text" w:eastAsia="Google Sans Text" w:hAnsi="Google Sans Text" w:cs="Google Sans Text"/>
           <w:color w:val="1F1F1F"/>
         </w:rPr>
-        <w:t xml:space="preserve">) Vartija-agentin tehtävä on muuntaa kaikki syötteet </w:t>
-      </w:r>
-      <w:r>
-        <w:rPr>
-          <w:rFonts w:ascii="Google Sans Text" w:eastAsia="Google Sans Text" w:hAnsi="Google Sans Text" w:cs="Google Sans Text"/>
-          <w:color w:val="1F1F1F"/>
-        </w:rPr>
-        <w:lastRenderedPageBreak/>
-        <w:t xml:space="preserve">(esim. PDF, DOCX) raakatekstiksi. Tämä pienentää hyökkäyspinta-alaa ja varmistaa datan yhdenmukaisuuden (OWASP Foundation 2025d). Tähän prosessiin kuuluu pakollinen datan normalisointi, joka on kriittistä merkistön eheyden ja </w:t>
+        <w:t xml:space="preserve">) Vartija-agentin tehtävä on muuntaa kaikki syötteet (esim. PDF, DOCX) raakatekstiksi. Tämä pienentää hyökkäyspinta-alaa ja varmistaa datan yhdenmukaisuuden (OWASP Foundation 2025d). Tähän prosessiin kuuluu pakollinen datan normalisointi, joka on kriittistä merkistön eheyden ja </w:t>
       </w:r>
       <w:proofErr w:type="spellStart"/>
       <w:r>
@@ -11805,6 +11877,7 @@
           <w:bCs/>
           <w:color w:val="1F1F1F"/>
         </w:rPr>
+        <w:lastRenderedPageBreak/>
         <w:t>Protokolla 2 (Kolmivaiheinen Validointi):</w:t>
       </w:r>
     </w:p>
@@ -11958,15 +12031,7 @@
           <w:rFonts w:ascii="Google Sans Text" w:eastAsia="Google Sans Text" w:hAnsi="Google Sans Text" w:cs="Google Sans Text"/>
           <w:color w:val="1F1F1F"/>
         </w:rPr>
-        <w:t xml:space="preserve"> Syötteen rakenteen kriittinen tarkastelu </w:t>
-      </w:r>
-      <w:r>
-        <w:rPr>
-          <w:rFonts w:ascii="Google Sans Text" w:eastAsia="Google Sans Text" w:hAnsi="Google Sans Text" w:cs="Google Sans Text"/>
-          <w:color w:val="1F1F1F"/>
-        </w:rPr>
-        <w:lastRenderedPageBreak/>
-        <w:t>anomaliatunnisteiden havaitsemiseksi, mikä toimii sekundaarisena suojana kehotemurtoja (LLM01) vastaan.</w:t>
+        <w:t xml:space="preserve"> Syötteen rakenteen kriittinen tarkastelu anomaliatunnisteiden havaitsemiseksi, mikä toimii sekundaarisena suojana kehotemurtoja (LLM01) vastaan.</w:t>
       </w:r>
     </w:p>
     <w:p>
@@ -12577,6 +12642,7 @@
           <w:iCs/>
           <w:color w:val="1F1F1F"/>
         </w:rPr>
+        <w:lastRenderedPageBreak/>
         <w:t>agency</w:t>
       </w:r>
       <w:proofErr w:type="spellEnd"/>
@@ -12749,7 +12815,6 @@
           <w:rFonts w:ascii="Google Sans Text" w:eastAsia="Google Sans Text" w:hAnsi="Google Sans Text" w:cs="Google Sans Text"/>
           <w:color w:val="1F1F1F"/>
         </w:rPr>
-        <w:lastRenderedPageBreak/>
         <w:t>Stanovichin</w:t>
       </w:r>
       <w:proofErr w:type="spellEnd"/>
@@ -13796,7 +13861,15 @@
           <w:rFonts w:ascii="Google Sans Text" w:eastAsia="Google Sans Text" w:hAnsi="Google Sans Text" w:cs="Google Sans Text"/>
           <w:color w:val="1F1F1F"/>
         </w:rPr>
-        <w:t>) merkitsemä data on luotettavaa. Agentit eivät saa luottaa syötteeseen, josta puuttuu kryptografinen (tai simuloitu) eheysleima.</w:t>
+        <w:t xml:space="preserve">) </w:t>
+      </w:r>
+      <w:r>
+        <w:rPr>
+          <w:rFonts w:ascii="Google Sans Text" w:eastAsia="Google Sans Text" w:hAnsi="Google Sans Text" w:cs="Google Sans Text"/>
+          <w:color w:val="1F1F1F"/>
+        </w:rPr>
+        <w:lastRenderedPageBreak/>
+        <w:t>merkitsemä data on luotettavaa. Agentit eivät saa luottaa syötteeseen, josta puuttuu kryptografinen (tai simuloitu) eheysleima.</w:t>
       </w:r>
     </w:p>
     <w:p>
@@ -13936,7 +14009,53 @@
           <w:rFonts w:ascii="Google Sans Text" w:eastAsia="Google Sans Text" w:hAnsi="Google Sans Text" w:cs="Google Sans Text"/>
           <w:color w:val="1F1F1F"/>
         </w:rPr>
-        <w:t xml:space="preserve"> Arvioinnin on perustuttava asiasisältöön, ei kielenhuollolliseen sujuvuuteen tai ulkoasuun. Tämä sääntö lievittää esteettistä vinoumaa.</w:t>
+        <w:t xml:space="preserve"> Arvioinnin on perustuttava asiasisältöön, ei kielenhuollolliseen sujuvuuteen tai ulkoasuun. </w:t>
+      </w:r>
+      <w:r>
+        <w:rPr>
+          <w:rFonts w:ascii="Google Sans Text" w:eastAsia="Google Sans Text" w:hAnsi="Google Sans Text" w:cs="Google Sans Text"/>
+          <w:color w:val="1F1F1F"/>
+        </w:rPr>
+        <w:t>T</w:t>
+      </w:r>
+      <w:r>
+        <w:rPr>
+          <w:rFonts w:ascii="Google Sans Text" w:eastAsia="Google Sans Text" w:hAnsi="Google Sans Text" w:cs="Google Sans Text"/>
+          <w:color w:val="1F1F1F"/>
+        </w:rPr>
+        <w:t>ämä sääntö lievittää esteettistä vinoumaa, joka tutkitusti vääristää laatuarviota visuaalisen miellyttävyyden perusteella (</w:t>
+      </w:r>
+      <w:proofErr w:type="spellStart"/>
+      <w:r>
+        <w:rPr>
+          <w:rFonts w:ascii="Google Sans Text" w:eastAsia="Google Sans Text" w:hAnsi="Google Sans Text" w:cs="Google Sans Text"/>
+          <w:color w:val="1F1F1F"/>
+        </w:rPr>
+        <w:t>Reinecke</w:t>
+      </w:r>
+      <w:proofErr w:type="spellEnd"/>
+      <w:r>
+        <w:rPr>
+          <w:rFonts w:ascii="Google Sans Text" w:eastAsia="Google Sans Text" w:hAnsi="Google Sans Text" w:cs="Google Sans Text"/>
+          <w:color w:val="1F1F1F"/>
+        </w:rPr>
+        <w:t xml:space="preserve"> &amp; </w:t>
+      </w:r>
+      <w:proofErr w:type="spellStart"/>
+      <w:r>
+        <w:rPr>
+          <w:rFonts w:ascii="Google Sans Text" w:eastAsia="Google Sans Text" w:hAnsi="Google Sans Text" w:cs="Google Sans Text"/>
+          <w:color w:val="1F1F1F"/>
+        </w:rPr>
+        <w:t>Gajos</w:t>
+      </w:r>
+      <w:proofErr w:type="spellEnd"/>
+      <w:r>
+        <w:rPr>
+          <w:rFonts w:ascii="Google Sans Text" w:eastAsia="Google Sans Text" w:hAnsi="Google Sans Text" w:cs="Google Sans Text"/>
+          <w:color w:val="1F1F1F"/>
+        </w:rPr>
+        <w:t xml:space="preserve"> 2014).</w:t>
       </w:r>
     </w:p>
     <w:p>
@@ -14016,15 +14135,7 @@
           <w:rFonts w:ascii="Google Sans Text" w:eastAsia="Google Sans Text" w:hAnsi="Google Sans Text" w:cs="Google Sans Text"/>
           <w:color w:val="1F1F1F"/>
         </w:rPr>
-        <w:t xml:space="preserve"> Jos prosessi on kitkaton ja virheetön, se on epäilyttävää. Aito oppiminen sisältää virheitä. </w:t>
-      </w:r>
-      <w:r>
-        <w:rPr>
-          <w:rFonts w:ascii="Google Sans Text" w:eastAsia="Google Sans Text" w:hAnsi="Google Sans Text" w:cs="Google Sans Text"/>
-          <w:color w:val="1F1F1F"/>
-        </w:rPr>
-        <w:lastRenderedPageBreak/>
-        <w:t>Täydellisyys liputetaan anomaliana.</w:t>
+        <w:t xml:space="preserve"> Jos prosessi on kitkaton ja virheetön, se on epäilyttävää. Aito oppiminen sisältää virheitä. Täydellisyys liputetaan anomaliana.</w:t>
       </w:r>
     </w:p>
     <w:p>
@@ -14433,7 +14544,15 @@
           <w:rFonts w:ascii="Google Sans Text" w:eastAsia="Google Sans Text" w:hAnsi="Google Sans Text" w:cs="Google Sans Text"/>
           <w:color w:val="1F1F1F"/>
         </w:rPr>
-        <w:t xml:space="preserve"> Raporttipohja ei ole passiivinen tiedonanto, vaan se pakottaa ihmisvalvojan aktiiviseen kognitiiviseen työhön. Tämä mekanismi on toteutettu siten, että XAI-Raportoija-agentti generoi "Kriittisiä Auditointikysymyksiä", joihin ihmisvalvojan on vastattava, erityisesti koskien JEM-erimielisyyksiä (Mandaatti 1).</w:t>
+        <w:t xml:space="preserve"> Raporttipohja ei ole passiivinen tiedonanto, vaan se pakottaa ihmisvalvojan aktiiviseen kognitiiviseen työhön. Tämä mekanismi on toteutettu siten, että XAI-Raportoija-agentti generoi </w:t>
+      </w:r>
+      <w:r>
+        <w:rPr>
+          <w:rFonts w:ascii="Google Sans Text" w:eastAsia="Google Sans Text" w:hAnsi="Google Sans Text" w:cs="Google Sans Text"/>
+          <w:color w:val="1F1F1F"/>
+        </w:rPr>
+        <w:lastRenderedPageBreak/>
+        <w:t>"Kriittisiä Auditointikysymyksiä", joihin ihmisvalvojan on vastattava, erityisesti koskien JEM-erimielisyyksiä (Mandaatti 1).</w:t>
       </w:r>
     </w:p>
     <w:p>
@@ -14599,7 +14718,6 @@
           <w:rFonts w:ascii="Google Sans Text" w:eastAsia="Google Sans Text" w:hAnsi="Google Sans Text" w:cs="Google Sans Text"/>
           <w:color w:val="1F1F1F"/>
         </w:rPr>
-        <w:lastRenderedPageBreak/>
         <w:t xml:space="preserve">Tämä kerros hallitsee myös muita systeemisiä riskejä hallinnollisilla käytännöillä. Turvaton tuotoksen käsittely (LLM05:2025) torjutaan tulosteen koodauksella (OWASP Foundation </w:t>
       </w:r>
       <w:proofErr w:type="gramStart"/>
@@ -24269,7 +24387,6 @@
   <w:style w:type="character" w:default="1" w:styleId="Kappaleenoletusfontti">
     <w:name w:val="Default Paragraph Font"/>
     <w:uiPriority w:val="1"/>
-    <w:semiHidden/>
     <w:unhideWhenUsed/>
   </w:style>
   <w:style w:type="table" w:default="1" w:styleId="Normaalitaulukko">

</xml_diff>

<commit_message>
feat: Implement a comprehensive structured cognitive agent architecture including core agents, hooks, tasks, and documentation.
</commit_message>
<xml_diff>
--- a/docs/Holistinen Mestaruus luku 2.docx
+++ b/docs/Holistinen Mestaruus luku 2.docx
@@ -4014,15 +4014,7 @@
           <w:rFonts w:ascii="Google Sans Text" w:eastAsia="Google Sans Text" w:hAnsi="Google Sans Text" w:cs="Google Sans Text"/>
           <w:color w:val="1F1F1F"/>
         </w:rPr>
-        <w:t xml:space="preserve"> on tehty, mutta </w:t>
-      </w:r>
-      <w:proofErr w:type="gramStart"/>
-      <w:r>
-        <w:rPr>
-          <w:rFonts w:ascii="Google Sans Text" w:eastAsia="Google Sans Text" w:hAnsi="Google Sans Text" w:cs="Google Sans Text"/>
-          <w:color w:val="1F1F1F"/>
-        </w:rPr>
-        <w:t xml:space="preserve">on sokea sille </w:t>
+        <w:t xml:space="preserve"> on tehty, mutta on sokea sille </w:t>
       </w:r>
       <w:r>
         <w:rPr>
@@ -4038,15 +4030,7 @@
           <w:rFonts w:ascii="Google Sans Text" w:eastAsia="Google Sans Text" w:hAnsi="Google Sans Text" w:cs="Google Sans Text"/>
           <w:color w:val="1F1F1F"/>
         </w:rPr>
-        <w:t xml:space="preserve"> työn teki</w:t>
-      </w:r>
-      <w:proofErr w:type="gramEnd"/>
-      <w:r>
-        <w:rPr>
-          <w:rFonts w:ascii="Google Sans Text" w:eastAsia="Google Sans Text" w:hAnsi="Google Sans Text" w:cs="Google Sans Text"/>
-          <w:color w:val="1F1F1F"/>
-        </w:rPr>
-        <w:t>. Strateginen matriisi (</w:t>
+        <w:t xml:space="preserve"> työn teki. Strateginen matriisi (</w:t>
       </w:r>
       <w:proofErr w:type="spellStart"/>
       <w:r>
@@ -4078,23 +4062,7 @@
           <w:rFonts w:ascii="Google Sans Text" w:eastAsia="Google Sans Text" w:hAnsi="Google Sans Text" w:cs="Google Sans Text"/>
           <w:color w:val="1F1F1F"/>
         </w:rPr>
-        <w:t xml:space="preserve">) korjaa tätä </w:t>
-      </w:r>
-      <w:proofErr w:type="gramStart"/>
-      <w:r>
-        <w:rPr>
-          <w:rFonts w:ascii="Google Sans Text" w:eastAsia="Google Sans Text" w:hAnsi="Google Sans Text" w:cs="Google Sans Text"/>
-          <w:color w:val="1F1F1F"/>
-        </w:rPr>
-        <w:t>mittaamalla</w:t>
-      </w:r>
-      <w:proofErr w:type="gramEnd"/>
-      <w:r>
-        <w:rPr>
-          <w:rFonts w:ascii="Google Sans Text" w:eastAsia="Google Sans Text" w:hAnsi="Google Sans Text" w:cs="Google Sans Text"/>
-          <w:color w:val="1F1F1F"/>
-        </w:rPr>
-        <w:t xml:space="preserve"> </w:t>
+        <w:t xml:space="preserve">) korjaa tätä mittaamalla </w:t>
       </w:r>
       <w:r>
         <w:rPr>
@@ -6260,9 +6228,95 @@
     </w:p>
     <w:p>
       <w:pPr>
+        <w:pBdr>
+          <w:top w:val="nil"/>
+          <w:left w:val="nil"/>
+          <w:bottom w:val="nil"/>
+          <w:right w:val="nil"/>
+          <w:between w:val="nil"/>
+        </w:pBdr>
+        <w:spacing w:after="240" w:line="275" w:lineRule="auto"/>
+        <w:rPr>
+          <w:rFonts w:ascii="Google Sans Text" w:eastAsia="Google Sans Text" w:hAnsi="Google Sans Text" w:cs="Google Sans Text"/>
+          <w:color w:val="1F1F1F"/>
+        </w:rPr>
+      </w:pPr>
+      <w:r>
+        <w:rPr>
+          <w:rFonts w:ascii="Google Sans Text" w:eastAsia="Google Sans Text" w:hAnsi="Google Sans Text" w:cs="Google Sans Text"/>
+          <w:color w:val="1F1F1F"/>
+        </w:rPr>
+        <w:t>Jos käyttäjä on 'Matkustaja' (Asteikon minimitaso, esim. 1 tai 10) missään kategoriassa, kokonaisarvosana leikataan automaattisesti asteikon alempaan kolmannekseen (</w:t>
+      </w:r>
+      <w:proofErr w:type="spellStart"/>
+      <w:r>
+        <w:rPr>
+          <w:rFonts w:ascii="Google Sans Text" w:eastAsia="Google Sans Text" w:hAnsi="Google Sans Text" w:cs="Google Sans Text"/>
+          <w:color w:val="1F1F1F"/>
+        </w:rPr>
+        <w:t>Lower</w:t>
+      </w:r>
+      <w:proofErr w:type="spellEnd"/>
+      <w:r>
+        <w:rPr>
+          <w:rFonts w:ascii="Google Sans Text" w:eastAsia="Google Sans Text" w:hAnsi="Google Sans Text" w:cs="Google Sans Text"/>
+          <w:color w:val="1F1F1F"/>
+        </w:rPr>
+        <w:t xml:space="preserve"> Third Cap).</w:t>
+      </w:r>
+    </w:p>
+    <w:p>
+      <w:pPr>
+        <w:pBdr>
+          <w:top w:val="nil"/>
+          <w:left w:val="nil"/>
+          <w:bottom w:val="nil"/>
+          <w:right w:val="nil"/>
+          <w:between w:val="nil"/>
+        </w:pBdr>
+        <w:spacing w:after="240" w:line="275" w:lineRule="auto"/>
+        <w:rPr>
+          <w:rFonts w:ascii="Google Sans Text" w:eastAsia="Google Sans Text" w:hAnsi="Google Sans Text" w:cs="Google Sans Text"/>
+          <w:color w:val="1F1F1F"/>
+        </w:rPr>
+      </w:pPr>
+      <w:r>
+        <w:rPr>
+          <w:rFonts w:ascii="Google Sans Text" w:eastAsia="Google Sans Text" w:hAnsi="Google Sans Text" w:cs="Google Sans Text"/>
+          <w:color w:val="1F1F1F"/>
+        </w:rPr>
+        <w:t>Laskukaava: Katto = Min + ((Max - Min) / 3).</w:t>
+      </w:r>
+    </w:p>
+    <w:p>
+      <w:pPr>
+        <w:pBdr>
+          <w:top w:val="nil"/>
+          <w:left w:val="nil"/>
+          <w:bottom w:val="nil"/>
+          <w:right w:val="nil"/>
+          <w:between w:val="nil"/>
+        </w:pBdr>
+        <w:spacing w:after="240" w:line="275" w:lineRule="auto"/>
+        <w:rPr>
+          <w:rFonts w:ascii="Google Sans Text" w:eastAsia="Google Sans Text" w:hAnsi="Google Sans Text" w:cs="Google Sans Text"/>
+          <w:color w:val="1F1F1F"/>
+        </w:rPr>
+      </w:pPr>
+      <w:r>
+        <w:rPr>
+          <w:rFonts w:ascii="Google Sans Text" w:eastAsia="Google Sans Text" w:hAnsi="Google Sans Text" w:cs="Google Sans Text"/>
+          <w:color w:val="1F1F1F"/>
+        </w:rPr>
+        <w:t>Esimerkiksi:</w:t>
+      </w:r>
+    </w:p>
+    <w:p>
+      <w:pPr>
+        <w:pStyle w:val="Luettelokappale"/>
         <w:numPr>
           <w:ilvl w:val="0"/>
-          <w:numId w:val="41"/>
+          <w:numId w:val="48"/>
         </w:numPr>
         <w:pBdr>
           <w:top w:val="nil"/>
@@ -6280,41 +6334,17 @@
       <w:r>
         <w:rPr>
           <w:rFonts w:ascii="Google Sans Text" w:eastAsia="Google Sans Text" w:hAnsi="Google Sans Text" w:cs="Google Sans Text"/>
-          <w:b/>
-          <w:bCs/>
-          <w:color w:val="1F1F1F"/>
-        </w:rPr>
-        <w:t>Sääntö:</w:t>
-      </w:r>
-      <w:r>
-        <w:rPr>
-          <w:rFonts w:ascii="Google Sans Text" w:eastAsia="Google Sans Text" w:hAnsi="Google Sans Text" w:cs="Google Sans Text"/>
-          <w:color w:val="1F1F1F"/>
-        </w:rPr>
-        <w:t xml:space="preserve"> Jos käyttäjä saa mistään kriteeristä tason 1 (Matkustaja), kokonaisarvosana </w:t>
-      </w:r>
-      <w:r>
-        <w:rPr>
-          <w:rFonts w:ascii="Google Sans Text" w:eastAsia="Google Sans Text" w:hAnsi="Google Sans Text" w:cs="Google Sans Text"/>
-          <w:b/>
-          <w:bCs/>
-          <w:color w:val="1F1F1F"/>
-        </w:rPr>
-        <w:t>EI SAA</w:t>
-      </w:r>
-      <w:r>
-        <w:rPr>
-          <w:rFonts w:ascii="Google Sans Text" w:eastAsia="Google Sans Text" w:hAnsi="Google Sans Text" w:cs="Google Sans Text"/>
-          <w:color w:val="1F1F1F"/>
-        </w:rPr>
-        <w:t xml:space="preserve"> ylittää tasoa 2/4.</w:t>
+          <w:color w:val="1F1F1F"/>
+        </w:rPr>
+        <w:t>Asteikko 1-4: Katto on 2.0.</w:t>
       </w:r>
     </w:p>
     <w:p>
       <w:pPr>
+        <w:pStyle w:val="Luettelokappale"/>
         <w:numPr>
           <w:ilvl w:val="0"/>
-          <w:numId w:val="41"/>
+          <w:numId w:val="48"/>
         </w:numPr>
         <w:pBdr>
           <w:top w:val="nil"/>
@@ -6332,6 +6362,52 @@
       <w:r>
         <w:rPr>
           <w:rFonts w:ascii="Google Sans Text" w:eastAsia="Google Sans Text" w:hAnsi="Google Sans Text" w:cs="Google Sans Text"/>
+          <w:color w:val="1F1F1F"/>
+        </w:rPr>
+        <w:t>Asteikko 1-100: Katto on 34.0.</w:t>
+      </w:r>
+    </w:p>
+    <w:p>
+      <w:pPr>
+        <w:pBdr>
+          <w:top w:val="nil"/>
+          <w:left w:val="nil"/>
+          <w:bottom w:val="nil"/>
+          <w:right w:val="nil"/>
+          <w:between w:val="nil"/>
+        </w:pBdr>
+        <w:spacing w:after="240" w:line="275" w:lineRule="auto"/>
+        <w:rPr>
+          <w:rFonts w:ascii="Google Sans Text" w:eastAsia="Google Sans Text" w:hAnsi="Google Sans Text" w:cs="Google Sans Text"/>
+          <w:color w:val="1F1F1F"/>
+        </w:rPr>
+      </w:pPr>
+      <w:r>
+        <w:rPr>
+          <w:rFonts w:ascii="Google Sans Text" w:eastAsia="Google Sans Text" w:hAnsi="Google Sans Text" w:cs="Google Sans Text"/>
+          <w:color w:val="1F1F1F"/>
+        </w:rPr>
+        <w:t>Tämä varmistaa, että 'Matkustaja'-tason suoritus ei voi koskaan nousta 'Kuski'-tasolle (Level 3/Ylempi puolikas), riippumatta käytetystä pisteytysasteikosta.</w:t>
+      </w:r>
+    </w:p>
+    <w:p>
+      <w:pPr>
+        <w:pBdr>
+          <w:top w:val="nil"/>
+          <w:left w:val="nil"/>
+          <w:bottom w:val="nil"/>
+          <w:right w:val="nil"/>
+          <w:between w:val="nil"/>
+        </w:pBdr>
+        <w:spacing w:after="240" w:line="275" w:lineRule="auto"/>
+        <w:rPr>
+          <w:rFonts w:ascii="Google Sans Text" w:eastAsia="Google Sans Text" w:hAnsi="Google Sans Text" w:cs="Google Sans Text"/>
+          <w:color w:val="1F1F1F"/>
+        </w:rPr>
+      </w:pPr>
+      <w:r>
+        <w:rPr>
+          <w:rFonts w:ascii="Google Sans Text" w:eastAsia="Google Sans Text" w:hAnsi="Google Sans Text" w:cs="Google Sans Text"/>
           <w:b/>
           <w:bCs/>
           <w:color w:val="1F1F1F"/>
@@ -6343,7 +6419,15 @@
           <w:rFonts w:ascii="Google Sans Text" w:eastAsia="Google Sans Text" w:hAnsi="Google Sans Text" w:cs="Google Sans Text"/>
           <w:color w:val="1F1F1F"/>
         </w:rPr>
-        <w:t xml:space="preserve"> Hyvä tekoäly ei kompensoi huonoa kuskia. Arvioimme prosessinhallintaa, emme tuuria. Jos käyttäjä nukkuu ratissa, suoritus hylätään, vaikka auto (AI) ajaisi maaliin.</w:t>
+        <w:t xml:space="preserve"> Hyvä tekoäly ei kompensoi huonoa kuskia. Arvioimme prosessinhallintaa, emme </w:t>
+      </w:r>
+      <w:r>
+        <w:rPr>
+          <w:rFonts w:ascii="Google Sans Text" w:eastAsia="Google Sans Text" w:hAnsi="Google Sans Text" w:cs="Google Sans Text"/>
+          <w:color w:val="1F1F1F"/>
+        </w:rPr>
+        <w:lastRenderedPageBreak/>
+        <w:t>tuuria. Jos käyttäjä nukkuu ratissa, suoritus hylätään, vaikka auto (AI) ajaisi maaliin.</w:t>
       </w:r>
     </w:p>
     <w:p>
@@ -6460,15 +6544,7 @@
           <w:rFonts w:ascii="Google Sans Text" w:eastAsia="Google Sans Text" w:hAnsi="Google Sans Text" w:cs="Google Sans Text"/>
           <w:color w:val="1F1F1F"/>
         </w:rPr>
-        <w:t xml:space="preserve"> Prosessi alkaa todistusaineiston keräämisestä ja </w:t>
-      </w:r>
-      <w:r>
-        <w:rPr>
-          <w:rFonts w:ascii="Google Sans Text" w:eastAsia="Google Sans Text" w:hAnsi="Google Sans Text" w:cs="Google Sans Text"/>
-          <w:color w:val="1F1F1F"/>
-        </w:rPr>
-        <w:lastRenderedPageBreak/>
-        <w:t>ankkuroinnista (Analyytikko-agentti, ks. Luku 2.3.3).</w:t>
+        <w:t xml:space="preserve"> Prosessi alkaa todistusaineiston keräämisestä ja ankkuroinnista (Analyytikko-agentti, ks. Luku 2.3.3).</w:t>
       </w:r>
     </w:p>
     <w:p>
@@ -6821,7 +6897,15 @@
           <w:rFonts w:ascii="Google Sans Text" w:eastAsia="Google Sans Text" w:hAnsi="Google Sans Text" w:cs="Google Sans Text"/>
           <w:color w:val="1F1F1F"/>
         </w:rPr>
-        <w:t xml:space="preserve"> ym. 2023; Liu, Yi ym. 2023; Liu, X. ym. 2024) sekä autonomisten agenttien erityisuhkiin (</w:t>
+        <w:t xml:space="preserve"> ym. 2023; Liu, Yi ym. 2023; Liu, X. </w:t>
+      </w:r>
+      <w:r>
+        <w:rPr>
+          <w:rFonts w:ascii="Google Sans Text" w:eastAsia="Google Sans Text" w:hAnsi="Google Sans Text" w:cs="Google Sans Text"/>
+          <w:color w:val="1F1F1F"/>
+        </w:rPr>
+        <w:lastRenderedPageBreak/>
+        <w:t>ym. 2024) sekä autonomisten agenttien erityisuhkiin (</w:t>
       </w:r>
       <w:proofErr w:type="spellStart"/>
       <w:r>
@@ -6852,88 +6936,148 @@
         <w:spacing w:after="240" w:line="275" w:lineRule="auto"/>
         <w:rPr>
           <w:rFonts w:ascii="Google Sans Text" w:eastAsia="Google Sans Text" w:hAnsi="Google Sans Text" w:cs="Google Sans Text"/>
-          <w:color w:val="1F1F1F"/>
-        </w:rPr>
-      </w:pPr>
-      <w:r>
-        <w:rPr>
-          <w:rFonts w:ascii="Google Sans Text" w:eastAsia="Google Sans Text" w:hAnsi="Google Sans Text" w:cs="Google Sans Text"/>
-          <w:color w:val="1F1F1F"/>
-        </w:rPr>
-        <w:t xml:space="preserve">Viimeisenä valmisteluvaiheena ja ainoastaan jos turvatarkistukset on läpäisty, Vartija-agentti merkitsee datan (engl. </w:t>
-      </w:r>
-      <w:r>
-        <w:rPr>
-          <w:rFonts w:ascii="Google Sans Text" w:eastAsia="Google Sans Text" w:hAnsi="Google Sans Text" w:cs="Google Sans Text"/>
           <w:i/>
           <w:iCs/>
           <w:color w:val="1F1F1F"/>
         </w:rPr>
-        <w:t xml:space="preserve">Input </w:t>
-      </w:r>
-      <w:proofErr w:type="spellStart"/>
-      <w:r>
-        <w:rPr>
-          <w:rFonts w:ascii="Google Sans Text" w:eastAsia="Google Sans Text" w:hAnsi="Google Sans Text" w:cs="Google Sans Text"/>
-          <w:i/>
-          <w:iCs/>
-          <w:color w:val="1F1F1F"/>
-        </w:rPr>
-        <w:t>Tainting</w:t>
-      </w:r>
-      <w:proofErr w:type="spellEnd"/>
-      <w:r>
-        <w:rPr>
-          <w:rFonts w:ascii="Google Sans Text" w:eastAsia="Google Sans Text" w:hAnsi="Google Sans Text" w:cs="Google Sans Text"/>
-          <w:color w:val="1F1F1F"/>
-        </w:rPr>
-        <w:t>) kokoamalla kaiken puhdistetun datan yhteen objektiin. Tämä luo perustan järjestelmän keskeiselle turvallisuussäännölle (ks. Luku 2.4.2.4, Sääntö 1: Luottamuksen Kehä, vain vartijan hyväksymä data on validia), joka perustuu turvallisen tiedonkulun periaatteisiin (</w:t>
-      </w:r>
-      <w:proofErr w:type="spellStart"/>
-      <w:r>
-        <w:rPr>
-          <w:rFonts w:ascii="Google Sans Text" w:eastAsia="Google Sans Text" w:hAnsi="Google Sans Text" w:cs="Google Sans Text"/>
-          <w:color w:val="1F1F1F"/>
-        </w:rPr>
-        <w:t>Denning</w:t>
-      </w:r>
-      <w:proofErr w:type="spellEnd"/>
-      <w:r>
-        <w:rPr>
-          <w:rFonts w:ascii="Google Sans Text" w:eastAsia="Google Sans Text" w:hAnsi="Google Sans Text" w:cs="Google Sans Text"/>
-          <w:color w:val="1F1F1F"/>
-        </w:rPr>
-        <w:t xml:space="preserve"> &amp; </w:t>
-      </w:r>
-      <w:proofErr w:type="spellStart"/>
-      <w:r>
-        <w:rPr>
-          <w:rFonts w:ascii="Google Sans Text" w:eastAsia="Google Sans Text" w:hAnsi="Google Sans Text" w:cs="Google Sans Text"/>
-          <w:color w:val="1F1F1F"/>
-        </w:rPr>
-        <w:t>Denning</w:t>
-      </w:r>
-      <w:proofErr w:type="spellEnd"/>
-      <w:r>
-        <w:rPr>
-          <w:rFonts w:ascii="Google Sans Text" w:eastAsia="Google Sans Text" w:hAnsi="Google Sans Text" w:cs="Google Sans Text"/>
-          <w:color w:val="1F1F1F"/>
-        </w:rPr>
-        <w:t xml:space="preserve"> 1977).</w:t>
-      </w:r>
-    </w:p>
-    <w:p>
-      <w:pPr>
-        <w:pStyle w:val="Otsikko4"/>
-      </w:pPr>
-      <w:r>
-        <w:t>2.3.</w:t>
-      </w:r>
-      <w:r>
-        <w:t>4</w:t>
-      </w:r>
-      <w:r>
-        <w:t xml:space="preserve"> Analyytikko-agentti: Todistepohjainen Ankkurointi (Vaihe 2)</w:t>
+      </w:pPr>
+      <w:r>
+        <w:rPr>
+          <w:rFonts w:ascii="Google Sans Text" w:eastAsia="Google Sans Text" w:hAnsi="Google Sans Text" w:cs="Google Sans Text"/>
+          <w:color w:val="1F1F1F"/>
+        </w:rPr>
+        <w:t>Viimeisenä valmisteluvaiheena ja ainoastaan jos turvatarkistukset on läpäisty, Vartija-agentti </w:t>
+      </w:r>
+      <w:r>
+        <w:rPr>
+          <w:rFonts w:ascii="Google Sans Text" w:eastAsia="Google Sans Text" w:hAnsi="Google Sans Text" w:cs="Google Sans Text"/>
+          <w:b/>
+          <w:bCs/>
+          <w:color w:val="1F1F1F"/>
+        </w:rPr>
+        <w:t>leimaa</w:t>
+      </w:r>
+      <w:r>
+        <w:rPr>
+          <w:rFonts w:ascii="Google Sans Text" w:eastAsia="Google Sans Text" w:hAnsi="Google Sans Text" w:cs="Google Sans Text"/>
+          <w:color w:val="1F1F1F"/>
+        </w:rPr>
+        <w:t xml:space="preserve"> alkuperäisen datan turvalliseksi (engl. Security </w:t>
+      </w:r>
+      <w:proofErr w:type="spellStart"/>
+      <w:r>
+        <w:rPr>
+          <w:rFonts w:ascii="Google Sans Text" w:eastAsia="Google Sans Text" w:hAnsi="Google Sans Text" w:cs="Google Sans Text"/>
+          <w:color w:val="1F1F1F"/>
+        </w:rPr>
+        <w:t>Stamping</w:t>
+      </w:r>
+      <w:proofErr w:type="spellEnd"/>
+      <w:r>
+        <w:rPr>
+          <w:rFonts w:ascii="Google Sans Text" w:eastAsia="Google Sans Text" w:hAnsi="Google Sans Text" w:cs="Google Sans Text"/>
+          <w:color w:val="1F1F1F"/>
+        </w:rPr>
+        <w:t>). Vartija ei luo uutta datakopiota (</w:t>
+      </w:r>
+      <w:proofErr w:type="spellStart"/>
+      <w:r>
+        <w:rPr>
+          <w:rFonts w:ascii="Google Sans Text" w:eastAsia="Google Sans Text" w:hAnsi="Google Sans Text" w:cs="Google Sans Text"/>
+          <w:color w:val="1F1F1F"/>
+        </w:rPr>
+        <w:t>token</w:t>
+      </w:r>
+      <w:proofErr w:type="spellEnd"/>
+      <w:r>
+        <w:rPr>
+          <w:rFonts w:ascii="Google Sans Text" w:eastAsia="Google Sans Text" w:hAnsi="Google Sans Text" w:cs="Google Sans Text"/>
+          <w:color w:val="1F1F1F"/>
+        </w:rPr>
+        <w:t>-talouden ja injektiosuojan vuoksi), vaan</w:t>
+      </w:r>
+      <w:r>
+        <w:rPr>
+          <w:rFonts w:ascii="Google Sans Text" w:eastAsia="Google Sans Text" w:hAnsi="Google Sans Text" w:cs="Google Sans Text"/>
+          <w:color w:val="1F1F1F"/>
+        </w:rPr>
+        <w:t xml:space="preserve"> p</w:t>
+      </w:r>
+      <w:r>
+        <w:rPr>
+          <w:rFonts w:ascii="Google Sans Text" w:eastAsia="Google Sans Text" w:hAnsi="Google Sans Text" w:cs="Google Sans Text"/>
+          <w:color w:val="1F1F1F"/>
+        </w:rPr>
+        <w:t>alauttaa</w:t>
+      </w:r>
+      <w:r>
+        <w:rPr>
+          <w:rFonts w:ascii="Google Sans Text" w:eastAsia="Google Sans Text" w:hAnsi="Google Sans Text" w:cs="Google Sans Text"/>
+          <w:color w:val="1F1F1F"/>
+        </w:rPr>
+        <w:t xml:space="preserve"> </w:t>
+      </w:r>
+      <w:r>
+        <w:rPr>
+          <w:rFonts w:ascii="Google Sans Text" w:eastAsia="Google Sans Text" w:hAnsi="Google Sans Text" w:cs="Google Sans Text"/>
+          <w:b/>
+          <w:bCs/>
+          <w:color w:val="1F1F1F"/>
+        </w:rPr>
+        <w:t>turvallisuusstatuksen</w:t>
+      </w:r>
+      <w:r>
+        <w:rPr>
+          <w:rFonts w:ascii="Google Sans Text" w:eastAsia="Google Sans Text" w:hAnsi="Google Sans Text" w:cs="Google Sans Text"/>
+          <w:color w:val="1F1F1F"/>
+        </w:rPr>
+        <w:t> (DATA_CHECKED_AND_SECURED). Tämä status toimii portinvartijana</w:t>
+      </w:r>
+      <w:r>
+        <w:rPr>
+          <w:rFonts w:ascii="Google Sans Text" w:eastAsia="Google Sans Text" w:hAnsi="Google Sans Text" w:cs="Google Sans Text"/>
+          <w:color w:val="1F1F1F"/>
+        </w:rPr>
+        <w:t xml:space="preserve"> ja </w:t>
+      </w:r>
+      <w:r>
+        <w:rPr>
+          <w:rFonts w:ascii="Google Sans Text" w:eastAsia="Google Sans Text" w:hAnsi="Google Sans Text" w:cs="Google Sans Text"/>
+          <w:color w:val="1F1F1F"/>
+        </w:rPr>
+        <w:t>ilman sitä prosessi keskeytyy välittömästi (</w:t>
+      </w:r>
+      <w:proofErr w:type="spellStart"/>
+      <w:r>
+        <w:rPr>
+          <w:rFonts w:ascii="Google Sans Text" w:eastAsia="Google Sans Text" w:hAnsi="Google Sans Text" w:cs="Google Sans Text"/>
+          <w:color w:val="1F1F1F"/>
+        </w:rPr>
+        <w:t>Circuit</w:t>
+      </w:r>
+      <w:proofErr w:type="spellEnd"/>
+      <w:r>
+        <w:rPr>
+          <w:rFonts w:ascii="Google Sans Text" w:eastAsia="Google Sans Text" w:hAnsi="Google Sans Text" w:cs="Google Sans Text"/>
+          <w:color w:val="1F1F1F"/>
+        </w:rPr>
+        <w:t xml:space="preserve"> </w:t>
+      </w:r>
+      <w:proofErr w:type="spellStart"/>
+      <w:r>
+        <w:rPr>
+          <w:rFonts w:ascii="Google Sans Text" w:eastAsia="Google Sans Text" w:hAnsi="Google Sans Text" w:cs="Google Sans Text"/>
+          <w:color w:val="1F1F1F"/>
+        </w:rPr>
+        <w:t>Breaker</w:t>
+      </w:r>
+      <w:proofErr w:type="spellEnd"/>
+      <w:r>
+        <w:rPr>
+          <w:rFonts w:ascii="Google Sans Text" w:eastAsia="Google Sans Text" w:hAnsi="Google Sans Text" w:cs="Google Sans Text"/>
+          <w:color w:val="1F1F1F"/>
+        </w:rPr>
+        <w:t>).</w:t>
       </w:r>
     </w:p>
     <w:p>
@@ -6956,85 +7100,90 @@
           <w:rFonts w:ascii="Google Sans Text" w:eastAsia="Google Sans Text" w:hAnsi="Google Sans Text" w:cs="Google Sans Text"/>
           <w:color w:val="1F1F1F"/>
         </w:rPr>
-        <w:lastRenderedPageBreak/>
-        <w:t xml:space="preserve">Analyytikko-agentti aloittaa analyysivaiheen luomalla ”todistuskartan”, joka perustuu </w:t>
-      </w:r>
-      <w:proofErr w:type="spellStart"/>
-      <w:r>
-        <w:rPr>
-          <w:rFonts w:ascii="Google Sans Text" w:eastAsia="Google Sans Text" w:hAnsi="Google Sans Text" w:cs="Google Sans Text"/>
-          <w:color w:val="1F1F1F"/>
-        </w:rPr>
-        <w:t>Shusterin</w:t>
-      </w:r>
-      <w:proofErr w:type="spellEnd"/>
-      <w:r>
-        <w:rPr>
-          <w:rFonts w:ascii="Google Sans Text" w:eastAsia="Google Sans Text" w:hAnsi="Google Sans Text" w:cs="Google Sans Text"/>
-          <w:color w:val="1F1F1F"/>
-        </w:rPr>
-        <w:t xml:space="preserve"> ym. (2021) kuvaamaan ankkuroituun tiedonhakuun (RAG), jolla pyritään minimoimaan kielimallien taipumusta hallusinointiin</w:t>
-      </w:r>
-      <w:r>
-        <w:rPr>
-          <w:rFonts w:ascii="Google Sans Text" w:eastAsia="Google Sans Text" w:hAnsi="Google Sans Text" w:cs="Google Sans Text"/>
-          <w:color w:val="1F1F1F"/>
-        </w:rPr>
-        <w:t xml:space="preserve"> noudattaen Sääntöä 1 (ks. Luku 2.4.2.4). Se toteuttaa tämän soveltamalla RAG-tyyppistä (engl. </w:t>
-      </w:r>
-      <w:proofErr w:type="spellStart"/>
-      <w:r>
-        <w:rPr>
-          <w:rFonts w:ascii="Google Sans Text" w:eastAsia="Google Sans Text" w:hAnsi="Google Sans Text" w:cs="Google Sans Text"/>
-          <w:i/>
-          <w:iCs/>
-          <w:color w:val="1F1F1F"/>
-        </w:rPr>
-        <w:t>Retrieval-Augmented</w:t>
-      </w:r>
-      <w:proofErr w:type="spellEnd"/>
-      <w:r>
-        <w:rPr>
-          <w:rFonts w:ascii="Google Sans Text" w:eastAsia="Google Sans Text" w:hAnsi="Google Sans Text" w:cs="Google Sans Text"/>
-          <w:i/>
-          <w:iCs/>
+        <w:t>Tämä mekanismi toteuttaa järjestelmän keskeisen turvallisuussäännön (ks. Luku 2.4.2.4,</w:t>
+      </w:r>
+      <w:r>
+        <w:rPr>
+          <w:rFonts w:ascii="Google Sans Text" w:eastAsia="Google Sans Text" w:hAnsi="Google Sans Text" w:cs="Google Sans Text"/>
           <w:color w:val="1F1F1F"/>
         </w:rPr>
         <w:t xml:space="preserve"> </w:t>
       </w:r>
-      <w:proofErr w:type="spellStart"/>
-      <w:r>
-        <w:rPr>
-          <w:rFonts w:ascii="Google Sans Text" w:eastAsia="Google Sans Text" w:hAnsi="Google Sans Text" w:cs="Google Sans Text"/>
-          <w:i/>
-          <w:iCs/>
-          <w:color w:val="1F1F1F"/>
-        </w:rPr>
-        <w:t>Generation</w:t>
-      </w:r>
-      <w:proofErr w:type="spellEnd"/>
-      <w:r>
-        <w:rPr>
-          <w:rFonts w:ascii="Google Sans Text" w:eastAsia="Google Sans Text" w:hAnsi="Google Sans Text" w:cs="Google Sans Text"/>
-          <w:color w:val="1F1F1F"/>
-        </w:rPr>
-        <w:t>) tiedonhakustrategiaa konteksti-ikkunan sisällä (Lewis ym. 2020), joka vähentää merkittävästi kielimallien taipumusta hallusinointiin (</w:t>
-      </w:r>
-      <w:proofErr w:type="spellStart"/>
-      <w:r>
-        <w:rPr>
-          <w:rFonts w:ascii="Google Sans Text" w:eastAsia="Google Sans Text" w:hAnsi="Google Sans Text" w:cs="Google Sans Text"/>
-          <w:color w:val="1F1F1F"/>
-        </w:rPr>
-        <w:t>Shuster</w:t>
-      </w:r>
-      <w:proofErr w:type="spellEnd"/>
-      <w:r>
-        <w:rPr>
-          <w:rFonts w:ascii="Google Sans Text" w:eastAsia="Google Sans Text" w:hAnsi="Google Sans Text" w:cs="Google Sans Text"/>
-          <w:color w:val="1F1F1F"/>
-        </w:rPr>
-        <w:t xml:space="preserve"> ym. 2021).</w:t>
+      <w:r>
+        <w:rPr>
+          <w:rFonts w:ascii="Google Sans Text" w:eastAsia="Google Sans Text" w:hAnsi="Google Sans Text" w:cs="Google Sans Text"/>
+          <w:color w:val="1F1F1F"/>
+        </w:rPr>
+        <w:t>Sääntö 1: Luottamuksen Kehä), joka pakottaa validoinnin ennen prosessointia (</w:t>
+      </w:r>
+      <w:proofErr w:type="spellStart"/>
+      <w:r>
+        <w:rPr>
+          <w:rFonts w:ascii="Google Sans Text" w:eastAsia="Google Sans Text" w:hAnsi="Google Sans Text" w:cs="Google Sans Text"/>
+          <w:color w:val="1F1F1F"/>
+        </w:rPr>
+        <w:t>Denning</w:t>
+      </w:r>
+      <w:proofErr w:type="spellEnd"/>
+      <w:r>
+        <w:rPr>
+          <w:rFonts w:ascii="Google Sans Text" w:eastAsia="Google Sans Text" w:hAnsi="Google Sans Text" w:cs="Google Sans Text"/>
+          <w:color w:val="1F1F1F"/>
+        </w:rPr>
+        <w:t xml:space="preserve"> &amp;</w:t>
+      </w:r>
+      <w:r>
+        <w:rPr>
+          <w:rFonts w:ascii="Google Sans Text" w:eastAsia="Google Sans Text" w:hAnsi="Google Sans Text" w:cs="Google Sans Text"/>
+          <w:color w:val="1F1F1F"/>
+        </w:rPr>
+        <w:t xml:space="preserve"> </w:t>
+      </w:r>
+      <w:proofErr w:type="spellStart"/>
+      <w:r>
+        <w:rPr>
+          <w:rFonts w:ascii="Google Sans Text" w:eastAsia="Google Sans Text" w:hAnsi="Google Sans Text" w:cs="Google Sans Text"/>
+          <w:color w:val="1F1F1F"/>
+        </w:rPr>
+        <w:t>Denning</w:t>
+      </w:r>
+      <w:proofErr w:type="spellEnd"/>
+      <w:r>
+        <w:rPr>
+          <w:rFonts w:ascii="Google Sans Text" w:eastAsia="Google Sans Text" w:hAnsi="Google Sans Text" w:cs="Google Sans Text"/>
+          <w:color w:val="1F1F1F"/>
+        </w:rPr>
+        <w:t xml:space="preserve"> 1977).</w:t>
+      </w:r>
+    </w:p>
+    <w:p>
+      <w:pPr>
+        <w:pStyle w:val="Otsikko5"/>
+      </w:pPr>
+      <w:r>
+        <w:t>2.</w:t>
+      </w:r>
+      <w:r>
+        <w:t xml:space="preserve">3.3.1 </w:t>
+      </w:r>
+      <w:r>
+        <w:t>Tekninen Arkkitehtuuripäätös: Sivuvaunu-malli (</w:t>
+      </w:r>
+      <w:proofErr w:type="spellStart"/>
+      <w:r>
+        <w:t>Sidecar</w:t>
+      </w:r>
+      <w:proofErr w:type="spellEnd"/>
+      <w:r>
+        <w:t xml:space="preserve"> </w:t>
+      </w:r>
+      <w:proofErr w:type="spellStart"/>
+      <w:r>
+        <w:t>Auditor</w:t>
+      </w:r>
+      <w:proofErr w:type="spellEnd"/>
+      <w:r>
+        <w:t>)</w:t>
       </w:r>
     </w:p>
     <w:p>
@@ -7057,73 +7206,48 @@
           <w:rFonts w:ascii="Google Sans Text" w:eastAsia="Google Sans Text" w:hAnsi="Google Sans Text" w:cs="Google Sans Text"/>
           <w:color w:val="1F1F1F"/>
         </w:rPr>
-        <w:t>RAG-arkkitehtuureilla on kuitenkin tunnettuja heikkouksia (Ahmad ym. 2024). Yksi merkittävä haaste on ”</w:t>
-      </w:r>
-      <w:proofErr w:type="spellStart"/>
-      <w:r>
-        <w:rPr>
-          <w:rFonts w:ascii="Google Sans Text" w:eastAsia="Google Sans Text" w:hAnsi="Google Sans Text" w:cs="Google Sans Text"/>
-          <w:color w:val="1F1F1F"/>
-        </w:rPr>
-        <w:t>lost</w:t>
-      </w:r>
-      <w:proofErr w:type="spellEnd"/>
-      <w:r>
-        <w:rPr>
-          <w:rFonts w:ascii="Google Sans Text" w:eastAsia="Google Sans Text" w:hAnsi="Google Sans Text" w:cs="Google Sans Text"/>
-          <w:color w:val="1F1F1F"/>
-        </w:rPr>
-        <w:t xml:space="preserve"> in </w:t>
-      </w:r>
-      <w:proofErr w:type="spellStart"/>
-      <w:r>
-        <w:rPr>
-          <w:rFonts w:ascii="Google Sans Text" w:eastAsia="Google Sans Text" w:hAnsi="Google Sans Text" w:cs="Google Sans Text"/>
-          <w:color w:val="1F1F1F"/>
-        </w:rPr>
-        <w:t>the</w:t>
-      </w:r>
-      <w:proofErr w:type="spellEnd"/>
-      <w:r>
-        <w:rPr>
-          <w:rFonts w:ascii="Google Sans Text" w:eastAsia="Google Sans Text" w:hAnsi="Google Sans Text" w:cs="Google Sans Text"/>
-          <w:color w:val="1F1F1F"/>
-        </w:rPr>
-        <w:t xml:space="preserve"> </w:t>
-      </w:r>
-      <w:proofErr w:type="spellStart"/>
-      <w:r>
-        <w:rPr>
-          <w:rFonts w:ascii="Google Sans Text" w:eastAsia="Google Sans Text" w:hAnsi="Google Sans Text" w:cs="Google Sans Text"/>
-          <w:color w:val="1F1F1F"/>
-        </w:rPr>
-        <w:t>middle</w:t>
-      </w:r>
-      <w:proofErr w:type="spellEnd"/>
-      <w:r>
-        <w:rPr>
-          <w:rFonts w:ascii="Google Sans Text" w:eastAsia="Google Sans Text" w:hAnsi="Google Sans Text" w:cs="Google Sans Text"/>
-          <w:color w:val="1F1F1F"/>
-        </w:rPr>
-        <w:t>” -ilmiö, jossa mallit eivät kykene hyödyntämään tehokkaasti tietoa pitkän konteksti-ikkunan keskellä (Liu, N. F. ym. 2024). Prototyyppivaiheessa tätä riskiä ei hallita teknisesti (esim. erillisellä uudelleensijoitusmallilla; vrt. Ma ym. 2024). Riskiä pyritään kuitenkin lieventämään operatiivisesti. Analyytikko-agentti on ohjeistettu toteuttamaan kaksivaiheisen prosessin: ensin agentti suorittaa laajan haun, minkä jälkeen se optimoi tulokset sijoittamalla tärkeimmät tulokset kontekstin alkuun ja loppuun. Tämä on kehotepohjainen strategia, joka perustuu Liu, N. F. ym. (2024) havaintoihin. Lisäksi agenttia ohjeistetaan kirjaamaan tämä riski XAI-raportointia varten.</w:t>
+        <w:t>Vartija-agentti on toteutettu rinnakkaisena tarkastajana (</w:t>
+      </w:r>
+      <w:proofErr w:type="spellStart"/>
+      <w:r>
+        <w:rPr>
+          <w:rFonts w:ascii="Google Sans Text" w:eastAsia="Google Sans Text" w:hAnsi="Google Sans Text" w:cs="Google Sans Text"/>
+          <w:color w:val="1F1F1F"/>
+        </w:rPr>
+        <w:t>Parallel</w:t>
+      </w:r>
+      <w:proofErr w:type="spellEnd"/>
+      <w:r>
+        <w:rPr>
+          <w:rFonts w:ascii="Google Sans Text" w:eastAsia="Google Sans Text" w:hAnsi="Google Sans Text" w:cs="Google Sans Text"/>
+          <w:color w:val="1F1F1F"/>
+        </w:rPr>
+        <w:t xml:space="preserve"> Audit), ei </w:t>
+      </w:r>
+      <w:proofErr w:type="spellStart"/>
+      <w:r>
+        <w:rPr>
+          <w:rFonts w:ascii="Google Sans Text" w:eastAsia="Google Sans Text" w:hAnsi="Google Sans Text" w:cs="Google Sans Text"/>
+          <w:color w:val="1F1F1F"/>
+        </w:rPr>
+        <w:t>sarjaankytkettynä</w:t>
+      </w:r>
+      <w:proofErr w:type="spellEnd"/>
+      <w:r>
+        <w:rPr>
+          <w:rFonts w:ascii="Google Sans Text" w:eastAsia="Google Sans Text" w:hAnsi="Google Sans Text" w:cs="Google Sans Text"/>
+          <w:color w:val="1F1F1F"/>
+        </w:rPr>
+        <w:t xml:space="preserve"> suodattimena.</w:t>
       </w:r>
     </w:p>
     <w:p>
       <w:pPr>
-        <w:pStyle w:val="Otsikko4"/>
-      </w:pPr>
-      <w:r>
-        <w:t>2.3.</w:t>
-      </w:r>
-      <w:r>
-        <w:t>5</w:t>
-      </w:r>
-      <w:r>
-        <w:t xml:space="preserve"> Loogikko-agentti: Argumentaation Rakentaminen (Vaihe 3)</w:t>
-      </w:r>
-    </w:p>
-    <w:p>
-      <w:pPr>
+        <w:pStyle w:val="Luettelokappale"/>
+        <w:numPr>
+          <w:ilvl w:val="0"/>
+          <w:numId w:val="49"/>
+        </w:numPr>
         <w:pBdr>
           <w:top w:val="nil"/>
           <w:left w:val="nil"/>
@@ -7142,89 +7266,16 @@
           <w:rFonts w:ascii="Google Sans Text" w:eastAsia="Google Sans Text" w:hAnsi="Google Sans Text" w:cs="Google Sans Text"/>
           <w:color w:val="1F1F1F"/>
         </w:rPr>
-        <w:t xml:space="preserve">Analyytikko-agentin tuottaman todistuskartan pohjalta Loogikko-agentti rakentaa muodollisen argumentin. Sen tehtävänä on muodostaa hypoteesi käyttäjän osaamistasosta soveltamalla Kognitiivista Arviointimatriisia (Taulukko 1), joka perustuu </w:t>
-      </w:r>
-      <w:proofErr w:type="spellStart"/>
-      <w:r>
-        <w:rPr>
-          <w:rFonts w:ascii="Google Sans Text" w:eastAsia="Google Sans Text" w:hAnsi="Google Sans Text" w:cs="Google Sans Text"/>
-          <w:color w:val="1F1F1F"/>
-        </w:rPr>
-        <w:t>Bloomin</w:t>
-      </w:r>
-      <w:proofErr w:type="spellEnd"/>
-      <w:r>
-        <w:rPr>
-          <w:rFonts w:ascii="Google Sans Text" w:eastAsia="Google Sans Text" w:hAnsi="Google Sans Text" w:cs="Google Sans Text"/>
-          <w:color w:val="1F1F1F"/>
-        </w:rPr>
-        <w:t xml:space="preserve"> taksonomiaan (Anderson &amp; </w:t>
-      </w:r>
-      <w:proofErr w:type="spellStart"/>
-      <w:r>
-        <w:rPr>
-          <w:rFonts w:ascii="Google Sans Text" w:eastAsia="Google Sans Text" w:hAnsi="Google Sans Text" w:cs="Google Sans Text"/>
-          <w:color w:val="1F1F1F"/>
-        </w:rPr>
-        <w:t>Krathwohl</w:t>
-      </w:r>
-      <w:proofErr w:type="spellEnd"/>
-      <w:r>
-        <w:rPr>
-          <w:rFonts w:ascii="Google Sans Text" w:eastAsia="Google Sans Text" w:hAnsi="Google Sans Text" w:cs="Google Sans Text"/>
-          <w:color w:val="1F1F1F"/>
-        </w:rPr>
-        <w:t xml:space="preserve"> 2001). Loogikko-agentti jäsentää analyysinsa systemaattisesti käyttäen </w:t>
-      </w:r>
-      <w:proofErr w:type="spellStart"/>
-      <w:r>
-        <w:rPr>
-          <w:rFonts w:ascii="Google Sans Text" w:eastAsia="Google Sans Text" w:hAnsi="Google Sans Text" w:cs="Google Sans Text"/>
-          <w:color w:val="1F1F1F"/>
-        </w:rPr>
-        <w:t>Toulminin</w:t>
-      </w:r>
-      <w:proofErr w:type="spellEnd"/>
-      <w:r>
-        <w:rPr>
-          <w:rFonts w:ascii="Google Sans Text" w:eastAsia="Google Sans Text" w:hAnsi="Google Sans Text" w:cs="Google Sans Text"/>
-          <w:color w:val="1F1F1F"/>
-        </w:rPr>
-        <w:t xml:space="preserve"> argumentaatiomallia (</w:t>
-      </w:r>
-      <w:proofErr w:type="spellStart"/>
-      <w:r>
-        <w:rPr>
-          <w:rFonts w:ascii="Google Sans Text" w:eastAsia="Google Sans Text" w:hAnsi="Google Sans Text" w:cs="Google Sans Text"/>
-          <w:color w:val="1F1F1F"/>
-        </w:rPr>
-        <w:t>Toulmin</w:t>
-      </w:r>
-      <w:proofErr w:type="spellEnd"/>
-      <w:r>
-        <w:rPr>
-          <w:rFonts w:ascii="Google Sans Text" w:eastAsia="Google Sans Text" w:hAnsi="Google Sans Text" w:cs="Google Sans Text"/>
-          <w:color w:val="1F1F1F"/>
-        </w:rPr>
-        <w:t xml:space="preserve"> 2003). Se esittää selkeän väitteen (osaamistaso), perusteet (viittaukset todistusaineistoon) ja oikeutuksen (päättelysäännöt matriisista). Tämä vaihe muuntaa raakadatan jäsennellyksi ja auditoitavaksi argumentiksi, joka on valmis seuraavan vaiheen kriittiseen tarkasteluun.</w:t>
+        <w:t>Mekanismi: Vartija analysoi syötteen ja palauttaa turvallisuusluokituksen (DATA_CHECKED_AND_SECURED), mutta ei toista alkuperäistä tekstiä.</w:t>
       </w:r>
     </w:p>
     <w:p>
       <w:pPr>
-        <w:pStyle w:val="Otsikko4"/>
-      </w:pPr>
-      <w:r>
-        <w:t>2.3.</w:t>
-      </w:r>
-      <w:r>
-        <w:t>6</w:t>
-      </w:r>
-      <w:r>
-        <w:t xml:space="preserve"> Kriitikkoryhmä: Systemaattinen Falsifiointi (Vaihe 4)</w:t>
-      </w:r>
-    </w:p>
-    <w:p>
-      <w:pPr>
+        <w:pStyle w:val="Luettelokappale"/>
+        <w:numPr>
+          <w:ilvl w:val="0"/>
+          <w:numId w:val="49"/>
+        </w:numPr>
         <w:pBdr>
           <w:top w:val="nil"/>
           <w:left w:val="nil"/>
@@ -7238,80 +7289,85 @@
           <w:color w:val="1F1F1F"/>
         </w:rPr>
       </w:pPr>
-      <w:proofErr w:type="gramStart"/>
-      <w:r>
-        <w:rPr>
-          <w:rFonts w:ascii="Google Sans Text" w:eastAsia="Google Sans Text" w:hAnsi="Google Sans Text" w:cs="Google Sans Text"/>
-          <w:color w:val="1F1F1F"/>
-        </w:rPr>
-        <w:t>  Neljännessä</w:t>
-      </w:r>
-      <w:proofErr w:type="gramEnd"/>
-      <w:r>
-        <w:rPr>
-          <w:rFonts w:ascii="Google Sans Text" w:eastAsia="Google Sans Text" w:hAnsi="Google Sans Text" w:cs="Google Sans Text"/>
-          <w:color w:val="1F1F1F"/>
-        </w:rPr>
-        <w:t xml:space="preserve"> vaiheessa muodostettu argumentti altistetaan systemaattiselle kumoamisyritykselle hyödyntäen </w:t>
-      </w:r>
-      <w:proofErr w:type="spellStart"/>
-      <w:r>
-        <w:rPr>
-          <w:rFonts w:ascii="Google Sans Text" w:eastAsia="Google Sans Text" w:hAnsi="Google Sans Text" w:cs="Google Sans Text"/>
-          <w:color w:val="1F1F1F"/>
-        </w:rPr>
-        <w:t>Popperin</w:t>
-      </w:r>
-      <w:proofErr w:type="spellEnd"/>
-      <w:r>
-        <w:rPr>
-          <w:rFonts w:ascii="Google Sans Text" w:eastAsia="Google Sans Text" w:hAnsi="Google Sans Text" w:cs="Google Sans Text"/>
-          <w:color w:val="1F1F1F"/>
-        </w:rPr>
-        <w:t xml:space="preserve"> (1934) falsifiointiperiaatetta, jota sovelletaan tässä moniagenttiympäristössä kriittisenä laadunvarmistusmekanismina</w:t>
-      </w:r>
-      <w:r>
-        <w:rPr>
-          <w:rFonts w:ascii="Google Sans Text" w:eastAsia="Google Sans Text" w:hAnsi="Google Sans Text" w:cs="Google Sans Text"/>
-          <w:color w:val="1F1F1F"/>
-        </w:rPr>
-        <w:t xml:space="preserve">. Tämän tehtävän suorittaa Kriitikkoryhmä, joka koostuu neljästä erikoistuneesta agentista (Looginen Falsifioija-agentti, Faktuaalinen ja Eettinen Valvoja-agentti, Kausaalinen Analyytikko-agentti, Performatiivisuuden Tunnistaja-agentti). Ryhmän tehtävä on toimia järjestelmän sisäisenä ”paholaisen asianajajana”, ja sen toiminta perustuu Karl </w:t>
-      </w:r>
-      <w:proofErr w:type="spellStart"/>
-      <w:r>
-        <w:rPr>
-          <w:rFonts w:ascii="Google Sans Text" w:eastAsia="Google Sans Text" w:hAnsi="Google Sans Text" w:cs="Google Sans Text"/>
-          <w:color w:val="1F1F1F"/>
-        </w:rPr>
-        <w:t>Popperin</w:t>
-      </w:r>
-      <w:proofErr w:type="spellEnd"/>
-      <w:r>
-        <w:rPr>
-          <w:rFonts w:ascii="Google Sans Text" w:eastAsia="Google Sans Text" w:hAnsi="Google Sans Text" w:cs="Google Sans Text"/>
-          <w:color w:val="1F1F1F"/>
-        </w:rPr>
-        <w:t xml:space="preserve"> falsifiointiperiaatteeseen: tieteellinen totuus selvitetään yrittämällä aktiivisesti kumota esitetyt väitteet (</w:t>
-      </w:r>
-      <w:proofErr w:type="spellStart"/>
-      <w:r>
-        <w:rPr>
-          <w:rFonts w:ascii="Google Sans Text" w:eastAsia="Google Sans Text" w:hAnsi="Google Sans Text" w:cs="Google Sans Text"/>
-          <w:color w:val="1F1F1F"/>
-        </w:rPr>
-        <w:t>Popper</w:t>
-      </w:r>
-      <w:proofErr w:type="spellEnd"/>
-      <w:r>
-        <w:rPr>
-          <w:rFonts w:ascii="Google Sans Text" w:eastAsia="Google Sans Text" w:hAnsi="Google Sans Text" w:cs="Google Sans Text"/>
-          <w:color w:val="1F1F1F"/>
-        </w:rPr>
-        <w:t xml:space="preserve"> 1934) (ks. Luku 2.4.3.2, Periaate 1).</w:t>
+      <w:r>
+        <w:rPr>
+          <w:rFonts w:ascii="Google Sans Text" w:eastAsia="Google Sans Text" w:hAnsi="Google Sans Text" w:cs="Google Sans Text"/>
+          <w:color w:val="1F1F1F"/>
+        </w:rPr>
+        <w:t>Perustelu: Tämä ehkäisee "</w:t>
+      </w:r>
+      <w:proofErr w:type="spellStart"/>
+      <w:r>
+        <w:rPr>
+          <w:rFonts w:ascii="Google Sans Text" w:eastAsia="Google Sans Text" w:hAnsi="Google Sans Text" w:cs="Google Sans Text"/>
+          <w:color w:val="1F1F1F"/>
+        </w:rPr>
+        <w:t>Prompt</w:t>
+      </w:r>
+      <w:proofErr w:type="spellEnd"/>
+      <w:r>
+        <w:rPr>
+          <w:rFonts w:ascii="Google Sans Text" w:eastAsia="Google Sans Text" w:hAnsi="Google Sans Text" w:cs="Google Sans Text"/>
+          <w:color w:val="1F1F1F"/>
+        </w:rPr>
+        <w:t xml:space="preserve"> </w:t>
+      </w:r>
+      <w:proofErr w:type="spellStart"/>
+      <w:r>
+        <w:rPr>
+          <w:rFonts w:ascii="Google Sans Text" w:eastAsia="Google Sans Text" w:hAnsi="Google Sans Text" w:cs="Google Sans Text"/>
+          <w:color w:val="1F1F1F"/>
+        </w:rPr>
+        <w:t>Injection</w:t>
+      </w:r>
+      <w:proofErr w:type="spellEnd"/>
+      <w:r>
+        <w:rPr>
+          <w:rFonts w:ascii="Google Sans Text" w:eastAsia="Google Sans Text" w:hAnsi="Google Sans Text" w:cs="Google Sans Text"/>
+          <w:color w:val="1F1F1F"/>
+        </w:rPr>
+        <w:t xml:space="preserve"> </w:t>
+      </w:r>
+      <w:proofErr w:type="spellStart"/>
+      <w:r>
+        <w:rPr>
+          <w:rFonts w:ascii="Google Sans Text" w:eastAsia="Google Sans Text" w:hAnsi="Google Sans Text" w:cs="Google Sans Text"/>
+          <w:color w:val="1F1F1F"/>
+        </w:rPr>
+        <w:t>Mirroring</w:t>
+      </w:r>
+      <w:proofErr w:type="spellEnd"/>
+      <w:r>
+        <w:rPr>
+          <w:rFonts w:ascii="Google Sans Text" w:eastAsia="Google Sans Text" w:hAnsi="Google Sans Text" w:cs="Google Sans Text"/>
+          <w:color w:val="1F1F1F"/>
+        </w:rPr>
+        <w:t xml:space="preserve">" -hyökkäykset (jossa tekoäly suorittaisi hyökkäyksen toistaessaan sitä) ja puolittaa </w:t>
+      </w:r>
+      <w:proofErr w:type="spellStart"/>
+      <w:r>
+        <w:rPr>
+          <w:rFonts w:ascii="Google Sans Text" w:eastAsia="Google Sans Text" w:hAnsi="Google Sans Text" w:cs="Google Sans Text"/>
+          <w:color w:val="1F1F1F"/>
+        </w:rPr>
+        <w:t>token</w:t>
+      </w:r>
+      <w:proofErr w:type="spellEnd"/>
+      <w:r>
+        <w:rPr>
+          <w:rFonts w:ascii="Google Sans Text" w:eastAsia="Google Sans Text" w:hAnsi="Google Sans Text" w:cs="Google Sans Text"/>
+          <w:color w:val="1F1F1F"/>
+        </w:rPr>
+        <w:t>-kustannukset massiivisilla syötteillä.</w:t>
       </w:r>
     </w:p>
     <w:p>
       <w:pPr>
+        <w:pStyle w:val="Luettelokappale"/>
+        <w:numPr>
+          <w:ilvl w:val="0"/>
+          <w:numId w:val="49"/>
+        </w:numPr>
         <w:pBdr>
           <w:top w:val="nil"/>
           <w:left w:val="nil"/>
@@ -7325,12 +7381,286 @@
           <w:color w:val="1F1F1F"/>
         </w:rPr>
       </w:pPr>
-      <w:r>
-        <w:rPr>
-          <w:rFonts w:ascii="Google Sans Text" w:eastAsia="Google Sans Text" w:hAnsi="Google Sans Text" w:cs="Google Sans Text"/>
-          <w:color w:val="1F1F1F"/>
-        </w:rPr>
-        <w:t xml:space="preserve">Sen sijaan, että ryhmä etsisi vahvistusta Loogikko-agentin havainnoille, sen tehtävä on yrittää aktiivisesti kumota Loogikko-agentin muodostama argumentti. Tämä on kriittinen vaihe, sillä </w:t>
+      <w:proofErr w:type="spellStart"/>
+      <w:r>
+        <w:rPr>
+          <w:rFonts w:ascii="Google Sans Text" w:eastAsia="Google Sans Text" w:hAnsi="Google Sans Text" w:cs="Google Sans Text"/>
+          <w:color w:val="1F1F1F"/>
+        </w:rPr>
+        <w:t>Kill</w:t>
+      </w:r>
+      <w:proofErr w:type="spellEnd"/>
+      <w:r>
+        <w:rPr>
+          <w:rFonts w:ascii="Google Sans Text" w:eastAsia="Google Sans Text" w:hAnsi="Google Sans Text" w:cs="Google Sans Text"/>
+          <w:color w:val="1F1F1F"/>
+        </w:rPr>
+        <w:t xml:space="preserve"> </w:t>
+      </w:r>
+      <w:proofErr w:type="spellStart"/>
+      <w:r>
+        <w:rPr>
+          <w:rFonts w:ascii="Google Sans Text" w:eastAsia="Google Sans Text" w:hAnsi="Google Sans Text" w:cs="Google Sans Text"/>
+          <w:color w:val="1F1F1F"/>
+        </w:rPr>
+        <w:t>Switch</w:t>
+      </w:r>
+      <w:proofErr w:type="spellEnd"/>
+      <w:r>
+        <w:rPr>
+          <w:rFonts w:ascii="Google Sans Text" w:eastAsia="Google Sans Text" w:hAnsi="Google Sans Text" w:cs="Google Sans Text"/>
+          <w:color w:val="1F1F1F"/>
+        </w:rPr>
+        <w:t>: Jos Vartija havaitsee uhkan (</w:t>
+      </w:r>
+      <w:proofErr w:type="spellStart"/>
+      <w:r>
+        <w:rPr>
+          <w:rFonts w:ascii="Google Sans Text" w:eastAsia="Google Sans Text" w:hAnsi="Google Sans Text" w:cs="Google Sans Text"/>
+          <w:color w:val="1F1F1F"/>
+        </w:rPr>
+        <w:t>threat_detected</w:t>
+      </w:r>
+      <w:proofErr w:type="spellEnd"/>
+      <w:r>
+        <w:rPr>
+          <w:rFonts w:ascii="Google Sans Text" w:eastAsia="Google Sans Text" w:hAnsi="Google Sans Text" w:cs="Google Sans Text"/>
+          <w:color w:val="1F1F1F"/>
+        </w:rPr>
+        <w:t xml:space="preserve">: </w:t>
+      </w:r>
+      <w:proofErr w:type="spellStart"/>
+      <w:r>
+        <w:rPr>
+          <w:rFonts w:ascii="Google Sans Text" w:eastAsia="Google Sans Text" w:hAnsi="Google Sans Text" w:cs="Google Sans Text"/>
+          <w:color w:val="1F1F1F"/>
+        </w:rPr>
+        <w:t>true</w:t>
+      </w:r>
+      <w:proofErr w:type="spellEnd"/>
+      <w:r>
+        <w:rPr>
+          <w:rFonts w:ascii="Google Sans Text" w:eastAsia="Google Sans Text" w:hAnsi="Google Sans Text" w:cs="Google Sans Text"/>
+          <w:color w:val="1F1F1F"/>
+        </w:rPr>
+        <w:t>), järjestelmä laukaisee välittömän keskeytyksen (</w:t>
+      </w:r>
+      <w:proofErr w:type="spellStart"/>
+      <w:r>
+        <w:rPr>
+          <w:rFonts w:ascii="Google Sans Text" w:eastAsia="Google Sans Text" w:hAnsi="Google Sans Text" w:cs="Google Sans Text"/>
+          <w:color w:val="1F1F1F"/>
+        </w:rPr>
+        <w:t>Circuit</w:t>
+      </w:r>
+      <w:proofErr w:type="spellEnd"/>
+      <w:r>
+        <w:rPr>
+          <w:rFonts w:ascii="Google Sans Text" w:eastAsia="Google Sans Text" w:hAnsi="Google Sans Text" w:cs="Google Sans Text"/>
+          <w:color w:val="1F1F1F"/>
+        </w:rPr>
+        <w:t xml:space="preserve"> </w:t>
+      </w:r>
+      <w:proofErr w:type="spellStart"/>
+      <w:r>
+        <w:rPr>
+          <w:rFonts w:ascii="Google Sans Text" w:eastAsia="Google Sans Text" w:hAnsi="Google Sans Text" w:cs="Google Sans Text"/>
+          <w:color w:val="1F1F1F"/>
+        </w:rPr>
+        <w:t>Breaker</w:t>
+      </w:r>
+      <w:proofErr w:type="spellEnd"/>
+      <w:r>
+        <w:rPr>
+          <w:rFonts w:ascii="Google Sans Text" w:eastAsia="Google Sans Text" w:hAnsi="Google Sans Text" w:cs="Google Sans Text"/>
+          <w:color w:val="1F1F1F"/>
+        </w:rPr>
+        <w:t>), jolloin saastunut data ei koskaan etene Analyytikolle.</w:t>
+      </w:r>
+    </w:p>
+    <w:p>
+      <w:pPr>
+        <w:pStyle w:val="Otsikko4"/>
+      </w:pPr>
+      <w:r>
+        <w:t>2.3.</w:t>
+      </w:r>
+      <w:r>
+        <w:t>4</w:t>
+      </w:r>
+      <w:r>
+        <w:t xml:space="preserve"> Analyytikko-agentti: Todistepohjainen Ankkurointi (Vaihe 2)</w:t>
+      </w:r>
+    </w:p>
+    <w:p>
+      <w:pPr>
+        <w:pBdr>
+          <w:top w:val="nil"/>
+          <w:left w:val="nil"/>
+          <w:bottom w:val="nil"/>
+          <w:right w:val="nil"/>
+          <w:between w:val="nil"/>
+        </w:pBdr>
+        <w:spacing w:after="240" w:line="275" w:lineRule="auto"/>
+        <w:rPr>
+          <w:rFonts w:ascii="Google Sans Text" w:eastAsia="Google Sans Text" w:hAnsi="Google Sans Text" w:cs="Google Sans Text"/>
+          <w:color w:val="1F1F1F"/>
+        </w:rPr>
+      </w:pPr>
+      <w:r>
+        <w:rPr>
+          <w:rFonts w:ascii="Google Sans Text" w:eastAsia="Google Sans Text" w:hAnsi="Google Sans Text" w:cs="Google Sans Text"/>
+          <w:color w:val="1F1F1F"/>
+        </w:rPr>
+        <w:t xml:space="preserve">Analyytikko-agentti aloittaa analyysivaiheen luomalla ”todistuskartan”, joka perustuu </w:t>
+      </w:r>
+      <w:proofErr w:type="spellStart"/>
+      <w:r>
+        <w:rPr>
+          <w:rFonts w:ascii="Google Sans Text" w:eastAsia="Google Sans Text" w:hAnsi="Google Sans Text" w:cs="Google Sans Text"/>
+          <w:color w:val="1F1F1F"/>
+        </w:rPr>
+        <w:t>Shusterin</w:t>
+      </w:r>
+      <w:proofErr w:type="spellEnd"/>
+      <w:r>
+        <w:rPr>
+          <w:rFonts w:ascii="Google Sans Text" w:eastAsia="Google Sans Text" w:hAnsi="Google Sans Text" w:cs="Google Sans Text"/>
+          <w:color w:val="1F1F1F"/>
+        </w:rPr>
+        <w:t xml:space="preserve"> ym. (2021) kuvaamaan ankkuroituun tiedonhakuun (RAG), jolla pyritään minimoimaan kielimallien taipumusta hallusinointiin</w:t>
+      </w:r>
+      <w:r>
+        <w:rPr>
+          <w:rFonts w:ascii="Google Sans Text" w:eastAsia="Google Sans Text" w:hAnsi="Google Sans Text" w:cs="Google Sans Text"/>
+          <w:color w:val="1F1F1F"/>
+        </w:rPr>
+        <w:t xml:space="preserve"> noudattaen Sääntöä 1 (ks. Luku 2.4.2.4). Se toteuttaa tämän soveltamalla RAG-tyyppistä (engl. </w:t>
+      </w:r>
+      <w:proofErr w:type="spellStart"/>
+      <w:r>
+        <w:rPr>
+          <w:rFonts w:ascii="Google Sans Text" w:eastAsia="Google Sans Text" w:hAnsi="Google Sans Text" w:cs="Google Sans Text"/>
+          <w:i/>
+          <w:iCs/>
+          <w:color w:val="1F1F1F"/>
+        </w:rPr>
+        <w:t>Retrieval-Augmented</w:t>
+      </w:r>
+      <w:proofErr w:type="spellEnd"/>
+      <w:r>
+        <w:rPr>
+          <w:rFonts w:ascii="Google Sans Text" w:eastAsia="Google Sans Text" w:hAnsi="Google Sans Text" w:cs="Google Sans Text"/>
+          <w:i/>
+          <w:iCs/>
+          <w:color w:val="1F1F1F"/>
+        </w:rPr>
+        <w:t xml:space="preserve"> </w:t>
+      </w:r>
+      <w:proofErr w:type="spellStart"/>
+      <w:r>
+        <w:rPr>
+          <w:rFonts w:ascii="Google Sans Text" w:eastAsia="Google Sans Text" w:hAnsi="Google Sans Text" w:cs="Google Sans Text"/>
+          <w:i/>
+          <w:iCs/>
+          <w:color w:val="1F1F1F"/>
+        </w:rPr>
+        <w:t>Generation</w:t>
+      </w:r>
+      <w:proofErr w:type="spellEnd"/>
+      <w:r>
+        <w:rPr>
+          <w:rFonts w:ascii="Google Sans Text" w:eastAsia="Google Sans Text" w:hAnsi="Google Sans Text" w:cs="Google Sans Text"/>
+          <w:color w:val="1F1F1F"/>
+        </w:rPr>
+        <w:t>) tiedonhakustrategiaa konteksti-ikkunan sisällä (Lewis ym. 2020), joka vähentää merkittävästi kielimallien taipumusta hallusinointiin (</w:t>
+      </w:r>
+      <w:proofErr w:type="spellStart"/>
+      <w:r>
+        <w:rPr>
+          <w:rFonts w:ascii="Google Sans Text" w:eastAsia="Google Sans Text" w:hAnsi="Google Sans Text" w:cs="Google Sans Text"/>
+          <w:color w:val="1F1F1F"/>
+        </w:rPr>
+        <w:t>Shuster</w:t>
+      </w:r>
+      <w:proofErr w:type="spellEnd"/>
+      <w:r>
+        <w:rPr>
+          <w:rFonts w:ascii="Google Sans Text" w:eastAsia="Google Sans Text" w:hAnsi="Google Sans Text" w:cs="Google Sans Text"/>
+          <w:color w:val="1F1F1F"/>
+        </w:rPr>
+        <w:t xml:space="preserve"> ym. 2021).</w:t>
+      </w:r>
+    </w:p>
+    <w:p>
+      <w:pPr>
+        <w:pBdr>
+          <w:top w:val="nil"/>
+          <w:left w:val="nil"/>
+          <w:bottom w:val="nil"/>
+          <w:right w:val="nil"/>
+          <w:between w:val="nil"/>
+        </w:pBdr>
+        <w:spacing w:after="240" w:line="275" w:lineRule="auto"/>
+        <w:rPr>
+          <w:rFonts w:ascii="Google Sans Text" w:eastAsia="Google Sans Text" w:hAnsi="Google Sans Text" w:cs="Google Sans Text"/>
+          <w:color w:val="1F1F1F"/>
+        </w:rPr>
+      </w:pPr>
+      <w:r>
+        <w:rPr>
+          <w:rFonts w:ascii="Google Sans Text" w:eastAsia="Google Sans Text" w:hAnsi="Google Sans Text" w:cs="Google Sans Text"/>
+          <w:color w:val="1F1F1F"/>
+        </w:rPr>
+        <w:t>RAG-arkkitehtuureilla on kuitenkin tunnettuja heikkouksia (Ahmad ym. 2024). Yksi merkittävä haaste on ”</w:t>
+      </w:r>
+      <w:proofErr w:type="spellStart"/>
+      <w:r>
+        <w:rPr>
+          <w:rFonts w:ascii="Google Sans Text" w:eastAsia="Google Sans Text" w:hAnsi="Google Sans Text" w:cs="Google Sans Text"/>
+          <w:color w:val="1F1F1F"/>
+        </w:rPr>
+        <w:t>lost</w:t>
+      </w:r>
+      <w:proofErr w:type="spellEnd"/>
+      <w:r>
+        <w:rPr>
+          <w:rFonts w:ascii="Google Sans Text" w:eastAsia="Google Sans Text" w:hAnsi="Google Sans Text" w:cs="Google Sans Text"/>
+          <w:color w:val="1F1F1F"/>
+        </w:rPr>
+        <w:t xml:space="preserve"> in </w:t>
+      </w:r>
+      <w:proofErr w:type="spellStart"/>
+      <w:r>
+        <w:rPr>
+          <w:rFonts w:ascii="Google Sans Text" w:eastAsia="Google Sans Text" w:hAnsi="Google Sans Text" w:cs="Google Sans Text"/>
+          <w:color w:val="1F1F1F"/>
+        </w:rPr>
+        <w:t>the</w:t>
+      </w:r>
+      <w:proofErr w:type="spellEnd"/>
+      <w:r>
+        <w:rPr>
+          <w:rFonts w:ascii="Google Sans Text" w:eastAsia="Google Sans Text" w:hAnsi="Google Sans Text" w:cs="Google Sans Text"/>
+          <w:color w:val="1F1F1F"/>
+        </w:rPr>
+        <w:t xml:space="preserve"> </w:t>
+      </w:r>
+      <w:proofErr w:type="spellStart"/>
+      <w:r>
+        <w:rPr>
+          <w:rFonts w:ascii="Google Sans Text" w:eastAsia="Google Sans Text" w:hAnsi="Google Sans Text" w:cs="Google Sans Text"/>
+          <w:color w:val="1F1F1F"/>
+        </w:rPr>
+        <w:t>middle</w:t>
+      </w:r>
+      <w:proofErr w:type="spellEnd"/>
+      <w:r>
+        <w:rPr>
+          <w:rFonts w:ascii="Google Sans Text" w:eastAsia="Google Sans Text" w:hAnsi="Google Sans Text" w:cs="Google Sans Text"/>
+          <w:color w:val="1F1F1F"/>
+        </w:rPr>
+        <w:t xml:space="preserve">” -ilmiö, jossa mallit eivät kykene hyödyntämään tehokkaasti tietoa pitkän konteksti-ikkunan keskellä (Liu, N. F. ym. 2024). Prototyyppivaiheessa tätä riskiä ei hallita teknisesti (esim. erillisellä uudelleensijoitusmallilla; vrt. Ma ym. 2024). Riskiä pyritään kuitenkin lieventämään operatiivisesti. Analyytikko-agentti on ohjeistettu toteuttamaan kaksivaiheisen prosessin: ensin agentti suorittaa laajan haun, minkä jälkeen se optimoi tulokset sijoittamalla tärkeimmät tulokset kontekstin alkuun ja loppuun. Tämä on kehotepohjainen strategia, joka perustuu Liu, N. F. ym. (2024) havaintoihin. Lisäksi agenttia </w:t>
       </w:r>
       <w:r>
         <w:rPr>
@@ -7338,7 +7668,223 @@
           <w:color w:val="1F1F1F"/>
         </w:rPr>
         <w:lastRenderedPageBreak/>
-        <w:t xml:space="preserve">ilman aktiivista haastamista tekoälymallit sortuvat helposti ”myötäilyvinoumaan” (engl. </w:t>
+        <w:t>ohjeistetaan kirjaamaan tämä riski XAI-raportointia varten.</w:t>
+      </w:r>
+    </w:p>
+    <w:p>
+      <w:pPr>
+        <w:pStyle w:val="Otsikko4"/>
+      </w:pPr>
+      <w:r>
+        <w:t>2.3.</w:t>
+      </w:r>
+      <w:r>
+        <w:t>5</w:t>
+      </w:r>
+      <w:r>
+        <w:t xml:space="preserve"> Loogikko-agentti: Argumentaation Rakentaminen (Vaihe 3)</w:t>
+      </w:r>
+    </w:p>
+    <w:p>
+      <w:pPr>
+        <w:pBdr>
+          <w:top w:val="nil"/>
+          <w:left w:val="nil"/>
+          <w:bottom w:val="nil"/>
+          <w:right w:val="nil"/>
+          <w:between w:val="nil"/>
+        </w:pBdr>
+        <w:spacing w:after="240" w:line="275" w:lineRule="auto"/>
+        <w:rPr>
+          <w:rFonts w:ascii="Google Sans Text" w:eastAsia="Google Sans Text" w:hAnsi="Google Sans Text" w:cs="Google Sans Text"/>
+          <w:color w:val="1F1F1F"/>
+        </w:rPr>
+      </w:pPr>
+      <w:r>
+        <w:rPr>
+          <w:rFonts w:ascii="Google Sans Text" w:eastAsia="Google Sans Text" w:hAnsi="Google Sans Text" w:cs="Google Sans Text"/>
+          <w:color w:val="1F1F1F"/>
+        </w:rPr>
+        <w:t xml:space="preserve">Analyytikko-agentin tuottaman todistuskartan pohjalta Loogikko-agentti rakentaa muodollisen argumentin. Sen tehtävänä on muodostaa hypoteesi käyttäjän osaamistasosta soveltamalla Kognitiivista Arviointimatriisia (Taulukko 1), joka perustuu </w:t>
+      </w:r>
+      <w:proofErr w:type="spellStart"/>
+      <w:r>
+        <w:rPr>
+          <w:rFonts w:ascii="Google Sans Text" w:eastAsia="Google Sans Text" w:hAnsi="Google Sans Text" w:cs="Google Sans Text"/>
+          <w:color w:val="1F1F1F"/>
+        </w:rPr>
+        <w:t>Bloomin</w:t>
+      </w:r>
+      <w:proofErr w:type="spellEnd"/>
+      <w:r>
+        <w:rPr>
+          <w:rFonts w:ascii="Google Sans Text" w:eastAsia="Google Sans Text" w:hAnsi="Google Sans Text" w:cs="Google Sans Text"/>
+          <w:color w:val="1F1F1F"/>
+        </w:rPr>
+        <w:t xml:space="preserve"> taksonomiaan (Anderson &amp; </w:t>
+      </w:r>
+      <w:proofErr w:type="spellStart"/>
+      <w:r>
+        <w:rPr>
+          <w:rFonts w:ascii="Google Sans Text" w:eastAsia="Google Sans Text" w:hAnsi="Google Sans Text" w:cs="Google Sans Text"/>
+          <w:color w:val="1F1F1F"/>
+        </w:rPr>
+        <w:t>Krathwohl</w:t>
+      </w:r>
+      <w:proofErr w:type="spellEnd"/>
+      <w:r>
+        <w:rPr>
+          <w:rFonts w:ascii="Google Sans Text" w:eastAsia="Google Sans Text" w:hAnsi="Google Sans Text" w:cs="Google Sans Text"/>
+          <w:color w:val="1F1F1F"/>
+        </w:rPr>
+        <w:t xml:space="preserve"> 2001). Loogikko-agentti jäsentää analyysinsa systemaattisesti käyttäen </w:t>
+      </w:r>
+      <w:proofErr w:type="spellStart"/>
+      <w:r>
+        <w:rPr>
+          <w:rFonts w:ascii="Google Sans Text" w:eastAsia="Google Sans Text" w:hAnsi="Google Sans Text" w:cs="Google Sans Text"/>
+          <w:color w:val="1F1F1F"/>
+        </w:rPr>
+        <w:t>Toulminin</w:t>
+      </w:r>
+      <w:proofErr w:type="spellEnd"/>
+      <w:r>
+        <w:rPr>
+          <w:rFonts w:ascii="Google Sans Text" w:eastAsia="Google Sans Text" w:hAnsi="Google Sans Text" w:cs="Google Sans Text"/>
+          <w:color w:val="1F1F1F"/>
+        </w:rPr>
+        <w:t xml:space="preserve"> argumentaatiomallia (</w:t>
+      </w:r>
+      <w:proofErr w:type="spellStart"/>
+      <w:r>
+        <w:rPr>
+          <w:rFonts w:ascii="Google Sans Text" w:eastAsia="Google Sans Text" w:hAnsi="Google Sans Text" w:cs="Google Sans Text"/>
+          <w:color w:val="1F1F1F"/>
+        </w:rPr>
+        <w:t>Toulmin</w:t>
+      </w:r>
+      <w:proofErr w:type="spellEnd"/>
+      <w:r>
+        <w:rPr>
+          <w:rFonts w:ascii="Google Sans Text" w:eastAsia="Google Sans Text" w:hAnsi="Google Sans Text" w:cs="Google Sans Text"/>
+          <w:color w:val="1F1F1F"/>
+        </w:rPr>
+        <w:t xml:space="preserve"> 2003). Se esittää selkeän väitteen (osaamistaso), perusteet (viittaukset todistusaineistoon) ja oikeutuksen (päättelysäännöt matriisista). Tämä vaihe muuntaa raakadatan jäsennellyksi ja auditoitavaksi argumentiksi, joka on valmis seuraavan vaiheen kriittiseen tarkasteluun.</w:t>
+      </w:r>
+    </w:p>
+    <w:p>
+      <w:pPr>
+        <w:pStyle w:val="Otsikko4"/>
+      </w:pPr>
+      <w:r>
+        <w:t>2.3.</w:t>
+      </w:r>
+      <w:r>
+        <w:t>6</w:t>
+      </w:r>
+      <w:r>
+        <w:t xml:space="preserve"> Kriitikkoryhmä: Systemaattinen Falsifiointi (Vaihe 4)</w:t>
+      </w:r>
+    </w:p>
+    <w:p>
+      <w:pPr>
+        <w:pBdr>
+          <w:top w:val="nil"/>
+          <w:left w:val="nil"/>
+          <w:bottom w:val="nil"/>
+          <w:right w:val="nil"/>
+          <w:between w:val="nil"/>
+        </w:pBdr>
+        <w:spacing w:after="240" w:line="275" w:lineRule="auto"/>
+        <w:rPr>
+          <w:rFonts w:ascii="Google Sans Text" w:eastAsia="Google Sans Text" w:hAnsi="Google Sans Text" w:cs="Google Sans Text"/>
+          <w:color w:val="1F1F1F"/>
+        </w:rPr>
+      </w:pPr>
+      <w:r>
+        <w:rPr>
+          <w:rFonts w:ascii="Google Sans Text" w:eastAsia="Google Sans Text" w:hAnsi="Google Sans Text" w:cs="Google Sans Text"/>
+          <w:color w:val="1F1F1F"/>
+        </w:rPr>
+        <w:t xml:space="preserve">  Neljännessä vaiheessa muodostettu argumentti altistetaan systemaattiselle kumoamisyritykselle hyödyntäen </w:t>
+      </w:r>
+      <w:proofErr w:type="spellStart"/>
+      <w:r>
+        <w:rPr>
+          <w:rFonts w:ascii="Google Sans Text" w:eastAsia="Google Sans Text" w:hAnsi="Google Sans Text" w:cs="Google Sans Text"/>
+          <w:color w:val="1F1F1F"/>
+        </w:rPr>
+        <w:t>Popperin</w:t>
+      </w:r>
+      <w:proofErr w:type="spellEnd"/>
+      <w:r>
+        <w:rPr>
+          <w:rFonts w:ascii="Google Sans Text" w:eastAsia="Google Sans Text" w:hAnsi="Google Sans Text" w:cs="Google Sans Text"/>
+          <w:color w:val="1F1F1F"/>
+        </w:rPr>
+        <w:t xml:space="preserve"> (1934) falsifiointiperiaatetta, jota sovelletaan tässä moniagenttiympäristössä kriittisenä laadunvarmistusmekanismina</w:t>
+      </w:r>
+      <w:r>
+        <w:rPr>
+          <w:rFonts w:ascii="Google Sans Text" w:eastAsia="Google Sans Text" w:hAnsi="Google Sans Text" w:cs="Google Sans Text"/>
+          <w:color w:val="1F1F1F"/>
+        </w:rPr>
+        <w:t xml:space="preserve">. Tämän tehtävän suorittaa Kriitikkoryhmä, joka koostuu neljästä erikoistuneesta agentista (Looginen Falsifioija-agentti, Faktuaalinen ja Eettinen Valvoja-agentti, Kausaalinen Analyytikko-agentti, Performatiivisuuden Tunnistaja-agentti). Ryhmän tehtävä on toimia järjestelmän sisäisenä ”paholaisen asianajajana”, ja sen toiminta perustuu Karl </w:t>
+      </w:r>
+      <w:proofErr w:type="spellStart"/>
+      <w:r>
+        <w:rPr>
+          <w:rFonts w:ascii="Google Sans Text" w:eastAsia="Google Sans Text" w:hAnsi="Google Sans Text" w:cs="Google Sans Text"/>
+          <w:color w:val="1F1F1F"/>
+        </w:rPr>
+        <w:t>Popperin</w:t>
+      </w:r>
+      <w:proofErr w:type="spellEnd"/>
+      <w:r>
+        <w:rPr>
+          <w:rFonts w:ascii="Google Sans Text" w:eastAsia="Google Sans Text" w:hAnsi="Google Sans Text" w:cs="Google Sans Text"/>
+          <w:color w:val="1F1F1F"/>
+        </w:rPr>
+        <w:t xml:space="preserve"> falsifiointiperiaatteeseen: tieteellinen totuus selvitetään yrittämällä aktiivisesti kumota esitetyt väitteet (</w:t>
+      </w:r>
+      <w:proofErr w:type="spellStart"/>
+      <w:r>
+        <w:rPr>
+          <w:rFonts w:ascii="Google Sans Text" w:eastAsia="Google Sans Text" w:hAnsi="Google Sans Text" w:cs="Google Sans Text"/>
+          <w:color w:val="1F1F1F"/>
+        </w:rPr>
+        <w:t>Popper</w:t>
+      </w:r>
+      <w:proofErr w:type="spellEnd"/>
+      <w:r>
+        <w:rPr>
+          <w:rFonts w:ascii="Google Sans Text" w:eastAsia="Google Sans Text" w:hAnsi="Google Sans Text" w:cs="Google Sans Text"/>
+          <w:color w:val="1F1F1F"/>
+        </w:rPr>
+        <w:t xml:space="preserve"> 1934) (ks. Luku 2.4.3.2, Periaate 1).</w:t>
+      </w:r>
+    </w:p>
+    <w:p>
+      <w:pPr>
+        <w:pBdr>
+          <w:top w:val="nil"/>
+          <w:left w:val="nil"/>
+          <w:bottom w:val="nil"/>
+          <w:right w:val="nil"/>
+          <w:between w:val="nil"/>
+        </w:pBdr>
+        <w:spacing w:after="240" w:line="275" w:lineRule="auto"/>
+        <w:rPr>
+          <w:rFonts w:ascii="Google Sans Text" w:eastAsia="Google Sans Text" w:hAnsi="Google Sans Text" w:cs="Google Sans Text"/>
+          <w:color w:val="1F1F1F"/>
+        </w:rPr>
+      </w:pPr>
+      <w:r>
+        <w:rPr>
+          <w:rFonts w:ascii="Google Sans Text" w:eastAsia="Google Sans Text" w:hAnsi="Google Sans Text" w:cs="Google Sans Text"/>
+          <w:color w:val="1F1F1F"/>
+        </w:rPr>
+        <w:t xml:space="preserve">Sen sijaan, että ryhmä etsisi vahvistusta Loogikko-agentin havainnoille, sen tehtävä on yrittää aktiivisesti kumota Loogikko-agentin muodostama argumentti. Tämä on kriittinen vaihe, sillä ilman aktiivista haastamista tekoälymallit sortuvat helposti ”myötäilyvinoumaan” (engl. </w:t>
       </w:r>
       <w:proofErr w:type="spellStart"/>
       <w:r>
@@ -7595,6 +8141,7 @@
           <w:bCs/>
           <w:color w:val="1F1F1F"/>
         </w:rPr>
+        <w:lastRenderedPageBreak/>
         <w:t>Päättelyn uskollisuus (</w:t>
       </w:r>
       <w:proofErr w:type="spellStart"/>
@@ -8178,15 +8725,7 @@
           <w:rFonts w:ascii="Google Sans Text" w:eastAsia="Google Sans Text" w:hAnsi="Google Sans Text" w:cs="Google Sans Text"/>
           <w:color w:val="1F1F1F"/>
         </w:rPr>
-        <w:t xml:space="preserve"> Agentti kuvittelee ideaalin </w:t>
-      </w:r>
-      <w:r>
-        <w:rPr>
-          <w:rFonts w:ascii="Google Sans Text" w:eastAsia="Google Sans Text" w:hAnsi="Google Sans Text" w:cs="Google Sans Text"/>
-          <w:color w:val="1F1F1F"/>
-        </w:rPr>
-        <w:lastRenderedPageBreak/>
-        <w:t>dokumentin, joka kumoaisi väitteen, ja käyttää sitä hakuna (</w:t>
+        <w:t xml:space="preserve"> Agentti kuvittelee ideaalin dokumentin, joka kumoaisi väitteen, ja käyttää sitä hakuna (</w:t>
       </w:r>
       <w:proofErr w:type="spellStart"/>
       <w:r>
@@ -8486,6 +9025,7 @@
           <w:rFonts w:ascii="Google Sans Text" w:eastAsia="Google Sans Text" w:hAnsi="Google Sans Text" w:cs="Google Sans Text"/>
           <w:color w:val="1F1F1F"/>
         </w:rPr>
+        <w:lastRenderedPageBreak/>
         <w:t>Protokolla etenee kolmivaiheisena prosessina, joka suoritetaan orkestrointikerroksessa ennen varsinaista agenttianalyysiä:</w:t>
       </w:r>
     </w:p>
@@ -9059,7 +9599,6 @@
           <w:rFonts w:ascii="Google Sans Text" w:eastAsia="Google Sans Text" w:hAnsi="Google Sans Text" w:cs="Google Sans Text"/>
           <w:color w:val="1F1F1F"/>
         </w:rPr>
-        <w:lastRenderedPageBreak/>
         <w:t>Verifiointitulos: Ristiriita / Vahvistus.</w:t>
       </w:r>
     </w:p>
@@ -9264,7 +9803,15 @@
           <w:rFonts w:ascii="Google Sans Text" w:eastAsia="Google Sans Text" w:hAnsi="Google Sans Text" w:cs="Google Sans Text"/>
           <w:color w:val="1F1F1F"/>
         </w:rPr>
-        <w:t xml:space="preserve"> Agentti kysyy: 'Jos käyttäjä EI olisi tehnyt tätä oivallusta, olisiko tulos silti ollut sama?'. Tämä on yritys simuloida syvällistä syy-seuraus-päättelyä (</w:t>
+        <w:t xml:space="preserve"> Agentti kysyy: 'Jos käyttäjä EI olisi tehnyt tätä oivallusta, olisiko tulos silti ollut sama?'. Tämä on yritys simuloida syvällistä </w:t>
+      </w:r>
+      <w:r>
+        <w:rPr>
+          <w:rFonts w:ascii="Google Sans Text" w:eastAsia="Google Sans Text" w:hAnsi="Google Sans Text" w:cs="Google Sans Text"/>
+          <w:color w:val="1F1F1F"/>
+        </w:rPr>
+        <w:lastRenderedPageBreak/>
+        <w:t>syy-seuraus-päättelyä (</w:t>
       </w:r>
       <w:proofErr w:type="spellStart"/>
       <w:r>
@@ -9785,7 +10332,6 @@
           <w:bCs/>
           <w:color w:val="1F1F1F"/>
         </w:rPr>
-        <w:lastRenderedPageBreak/>
         <w:t>Itsetehostuksen Indikaattorit:</w:t>
       </w:r>
       <w:r>
@@ -9941,7 +10487,15 @@
           <w:rFonts w:ascii="Google Sans Text" w:eastAsia="Google Sans Text" w:hAnsi="Google Sans Text" w:cs="Google Sans Text"/>
           <w:color w:val="1F1F1F"/>
         </w:rPr>
-        <w:t>On kuitenkin huomattava, että ilman ulkoista maailmanmallia kielimalli ei kykene muodolliseen kausaaliseen päättelyyn (Chi ym. 2024), joten näiden agenttien (Kausaalinen Analyytikko-agentti ja Performatiivisuuden Tunnistaja-agentti) suorittamat testit mittaavat ensisijaisesti narratiivin loogista eheyttä eivätkä sen empiiristä totuusarvoa. Siksi nämä testit ovat "kielellisiä approksimaatioita" – ne ovat parhaita mahdollisia arvauksia, eivät matemaattisen tarkkoja todisteita. Tämä tekee järjestelmästä haavoittuvan taitavalle manipuloinnille.</w:t>
+        <w:t xml:space="preserve">On kuitenkin huomattava, että ilman ulkoista maailmanmallia kielimalli ei kykene muodolliseen kausaaliseen päättelyyn (Chi ym. 2024), joten näiden agenttien (Kausaalinen Analyytikko-agentti ja Performatiivisuuden Tunnistaja-agentti) suorittamat testit mittaavat ensisijaisesti narratiivin loogista eheyttä eivätkä sen empiiristä totuusarvoa. Siksi nämä testit ovat "kielellisiä approksimaatioita" – ne ovat parhaita mahdollisia arvauksia, eivät matemaattisen </w:t>
+      </w:r>
+      <w:r>
+        <w:rPr>
+          <w:rFonts w:ascii="Google Sans Text" w:eastAsia="Google Sans Text" w:hAnsi="Google Sans Text" w:cs="Google Sans Text"/>
+          <w:color w:val="1F1F1F"/>
+        </w:rPr>
+        <w:lastRenderedPageBreak/>
+        <w:t>tarkkoja todisteita. Tämä tekee järjestelmästä haavoittuvan taitavalle manipuloinnille.</w:t>
       </w:r>
     </w:p>
     <w:p>
@@ -10398,15 +10952,7 @@
           <w:rFonts w:ascii="Google Sans Text" w:eastAsia="Google Sans Text" w:hAnsi="Google Sans Text" w:cs="Google Sans Text"/>
           <w:color w:val="1F1F1F"/>
         </w:rPr>
-        <w:t xml:space="preserve">). Mikäli järjestelmä ei pysty varmentamaan arkkitehtuurin eheyttä (esim. heterogeenisyyden </w:t>
-      </w:r>
-      <w:r>
-        <w:rPr>
-          <w:rFonts w:ascii="Google Sans Text" w:eastAsia="Google Sans Text" w:hAnsi="Google Sans Text" w:cs="Google Sans Text"/>
-          <w:color w:val="1F1F1F"/>
-        </w:rPr>
-        <w:lastRenderedPageBreak/>
-        <w:t>puute; ks. Luku 2.4.2.4, Vaatimus 1), luotettavuusaste laskee automaattisesti tasolle "EHDOLLEINEN", mikä signaloi ihmisvalvojalle pakollista tarkistustarvetta noudattaen Protokollaa 4 (ks. Luku 2.4.3.3).</w:t>
+        <w:t>). Mikäli järjestelmä ei pysty varmentamaan arkkitehtuurin eheyttä (esim. heterogeenisyyden puute; ks. Luku 2.4.2.4, Vaatimus 1), luotettavuusaste laskee automaattisesti tasolle "EHDOLLEINEN", mikä signaloi ihmisvalvojalle pakollista tarkistustarvetta noudattaen Protokollaa 4 (ks. Luku 2.4.3.3).</w:t>
       </w:r>
     </w:p>
     <w:p>
@@ -10597,7 +11143,15 @@
           <w:rFonts w:ascii="Google Sans Text" w:eastAsia="Google Sans Text" w:hAnsi="Google Sans Text" w:cs="Google Sans Text"/>
           <w:color w:val="1F1F1F"/>
         </w:rPr>
-        <w:t>-komponentin logiikka pakottaa arvosanat laskemaan automaattisesti, mikäli edeltävät vaiheet ovat liputtaneet fataaleja virheitä:</w:t>
+        <w:t xml:space="preserve">-komponentin logiikka pakottaa </w:t>
+      </w:r>
+      <w:r>
+        <w:rPr>
+          <w:rFonts w:ascii="Google Sans Text" w:eastAsia="Google Sans Text" w:hAnsi="Google Sans Text" w:cs="Google Sans Text"/>
+          <w:color w:val="1F1F1F"/>
+        </w:rPr>
+        <w:lastRenderedPageBreak/>
+        <w:t>arvosanat laskemaan automaattisesti, mikäli edeltävät vaiheet ovat liputtaneet fataaleja virheitä:</w:t>
       </w:r>
     </w:p>
     <w:p>
@@ -11003,7 +11557,6 @@
           <w:bCs/>
           <w:color w:val="1F1F1F"/>
         </w:rPr>
-        <w:lastRenderedPageBreak/>
         <w:t>Kontekstuaalinen haku:</w:t>
       </w:r>
       <w:r>
@@ -11217,7 +11770,15 @@
           <w:rFonts w:ascii="Google Sans Text" w:eastAsia="Google Sans Text" w:hAnsi="Google Sans Text" w:cs="Google Sans Text"/>
           <w:color w:val="1F1F1F"/>
         </w:rPr>
-        <w:t>Kun arkkitehtuurin rakenne ja operatiivinen prosessi on kuvattu, tämä viimeinen osio keskittyy järjestelmän eheyden, turvallisuuden ja luotettavuuden varmistaviin mekanismeihin. Arkkitehtoniset tasot edellyttävät selkeää hallintamallia, joka muodostaa hierarkkisen kontrollirakenteen. Osio kuvaa hallintamallin, joka on toteutettu monikerroksisena puolustusstrategiana (</w:t>
+        <w:t xml:space="preserve">Kun arkkitehtuurin rakenne ja operatiivinen prosessi on kuvattu, tämä viimeinen osio keskittyy </w:t>
+      </w:r>
+      <w:r>
+        <w:rPr>
+          <w:rFonts w:ascii="Google Sans Text" w:eastAsia="Google Sans Text" w:hAnsi="Google Sans Text" w:cs="Google Sans Text"/>
+          <w:color w:val="1F1F1F"/>
+        </w:rPr>
+        <w:lastRenderedPageBreak/>
+        <w:t>järjestelmän eheyden, turvallisuuden ja luotettavuuden varmistaviin mekanismeihin. Arkkitehtoniset tasot edellyttävät selkeää hallintamallia, joka muodostaa hierarkkisen kontrollirakenteen. Osio kuvaa hallintamallin, joka on toteutettu monikerroksisena puolustusstrategiana (</w:t>
       </w:r>
       <w:proofErr w:type="spellStart"/>
       <w:r>
@@ -11466,7 +12027,6 @@
         <w:pStyle w:val="Otsikko4"/>
       </w:pPr>
       <w:r>
-        <w:lastRenderedPageBreak/>
         <w:t>2.4.2 Tekninen Kontrollikerros</w:t>
       </w:r>
     </w:p>
@@ -11623,7 +12183,15 @@
           <w:rFonts w:ascii="Google Sans Text" w:eastAsia="Google Sans Text" w:hAnsi="Google Sans Text" w:cs="Google Sans Text"/>
           <w:color w:val="1F1F1F"/>
         </w:rPr>
-        <w:t xml:space="preserve"> varmistamiseksi, erityisesti manuaalisessa orkestroinnissa (vrt. Luku 5.2.4; W3C 2008). Normalisointi sisältää pakollisen UTF-8-merkistökoodauksen varmistamisen sekä typografisten merkkien (kuten "älykkäiden lainausmerkkien") muuntamisen standardeiksi ASCII-merkeiksi. Tämän jälkeen se poistaa aktiivisesti kaikki tunnetut haitalliset merkit, skriptit ja ohjausmerkit (engl. </w:t>
+        <w:t xml:space="preserve"> varmistamiseksi, </w:t>
+      </w:r>
+      <w:r>
+        <w:rPr>
+          <w:rFonts w:ascii="Google Sans Text" w:eastAsia="Google Sans Text" w:hAnsi="Google Sans Text" w:cs="Google Sans Text"/>
+          <w:color w:val="1F1F1F"/>
+        </w:rPr>
+        <w:lastRenderedPageBreak/>
+        <w:t xml:space="preserve">erityisesti manuaalisessa orkestroinnissa (vrt. Luku 5.2.4; W3C 2008). Normalisointi sisältää pakollisen UTF-8-merkistökoodauksen varmistamisen sekä typografisten merkkien (kuten "älykkäiden lainausmerkkien") muuntamisen standardeiksi ASCII-merkeiksi. Tämän jälkeen se poistaa aktiivisesti kaikki tunnetut haitalliset merkit, skriptit ja ohjausmerkit (engl. </w:t>
       </w:r>
       <w:proofErr w:type="spellStart"/>
       <w:r>
@@ -11877,7 +12445,6 @@
           <w:bCs/>
           <w:color w:val="1F1F1F"/>
         </w:rPr>
-        <w:lastRenderedPageBreak/>
         <w:t>Protokolla 2 (Kolmivaiheinen Validointi):</w:t>
       </w:r>
     </w:p>
@@ -12120,6 +12687,7 @@
           <w:bCs/>
           <w:color w:val="1F1F1F"/>
         </w:rPr>
+        <w:lastRenderedPageBreak/>
         <w:t>Koskee:</w:t>
       </w:r>
       <w:r>
@@ -12642,7 +13210,6 @@
           <w:iCs/>
           <w:color w:val="1F1F1F"/>
         </w:rPr>
-        <w:lastRenderedPageBreak/>
         <w:t>agency</w:t>
       </w:r>
       <w:proofErr w:type="spellEnd"/>
@@ -12879,6 +13446,7 @@
           <w:bCs/>
           <w:color w:val="1F1F1F"/>
         </w:rPr>
+        <w:lastRenderedPageBreak/>
         <w:t xml:space="preserve">Mandaatti 2 (Vinoumien Torjunta / </w:t>
       </w:r>
       <w:proofErr w:type="spellStart"/>
@@ -13861,15 +14429,7 @@
           <w:rFonts w:ascii="Google Sans Text" w:eastAsia="Google Sans Text" w:hAnsi="Google Sans Text" w:cs="Google Sans Text"/>
           <w:color w:val="1F1F1F"/>
         </w:rPr>
-        <w:t xml:space="preserve">) </w:t>
-      </w:r>
-      <w:r>
-        <w:rPr>
-          <w:rFonts w:ascii="Google Sans Text" w:eastAsia="Google Sans Text" w:hAnsi="Google Sans Text" w:cs="Google Sans Text"/>
-          <w:color w:val="1F1F1F"/>
-        </w:rPr>
-        <w:lastRenderedPageBreak/>
-        <w:t>merkitsemä data on luotettavaa. Agentit eivät saa luottaa syötteeseen, josta puuttuu kryptografinen (tai simuloitu) eheysleima.</w:t>
+        <w:t>) merkitsemä data on luotettavaa. Agentit eivät saa luottaa syötteeseen, josta puuttuu kryptografinen (tai simuloitu) eheysleima.</w:t>
       </w:r>
     </w:p>
     <w:p>
@@ -14215,7 +14775,15 @@
           <w:rFonts w:ascii="Google Sans Text" w:eastAsia="Google Sans Text" w:hAnsi="Google Sans Text" w:cs="Google Sans Text"/>
           <w:color w:val="1F1F1F"/>
         </w:rPr>
-        <w:t xml:space="preserve"> XAI-raportin on aina eriteltävä epävarmuuden lähteet. Väärä varmuus on pahempaa kuin tietämättömyys.</w:t>
+        <w:t xml:space="preserve"> XAI-raportin on aina </w:t>
+      </w:r>
+      <w:r>
+        <w:rPr>
+          <w:rFonts w:ascii="Google Sans Text" w:eastAsia="Google Sans Text" w:hAnsi="Google Sans Text" w:cs="Google Sans Text"/>
+          <w:color w:val="1F1F1F"/>
+        </w:rPr>
+        <w:lastRenderedPageBreak/>
+        <w:t>eriteltävä epävarmuuden lähteet. Väärä varmuus on pahempaa kuin tietämättömyys.</w:t>
       </w:r>
     </w:p>
     <w:p>
@@ -14544,15 +15112,7 @@
           <w:rFonts w:ascii="Google Sans Text" w:eastAsia="Google Sans Text" w:hAnsi="Google Sans Text" w:cs="Google Sans Text"/>
           <w:color w:val="1F1F1F"/>
         </w:rPr>
-        <w:t xml:space="preserve"> Raporttipohja ei ole passiivinen tiedonanto, vaan se pakottaa ihmisvalvojan aktiiviseen kognitiiviseen työhön. Tämä mekanismi on toteutettu siten, että XAI-Raportoija-agentti generoi </w:t>
-      </w:r>
-      <w:r>
-        <w:rPr>
-          <w:rFonts w:ascii="Google Sans Text" w:eastAsia="Google Sans Text" w:hAnsi="Google Sans Text" w:cs="Google Sans Text"/>
-          <w:color w:val="1F1F1F"/>
-        </w:rPr>
-        <w:lastRenderedPageBreak/>
-        <w:t>"Kriittisiä Auditointikysymyksiä", joihin ihmisvalvojan on vastattava, erityisesti koskien JEM-erimielisyyksiä (Mandaatti 1).</w:t>
+        <w:t xml:space="preserve"> Raporttipohja ei ole passiivinen tiedonanto, vaan se pakottaa ihmisvalvojan aktiiviseen kognitiiviseen työhön. Tämä mekanismi on toteutettu siten, että XAI-Raportoija-agentti generoi "Kriittisiä Auditointikysymyksiä", joihin ihmisvalvojan on vastattava, erityisesti koskien JEM-erimielisyyksiä (Mandaatti 1).</w:t>
       </w:r>
     </w:p>
     <w:p>
@@ -14720,21 +15280,13 @@
         </w:rPr>
         <w:t xml:space="preserve">Tämä kerros hallitsee myös muita systeemisiä riskejä hallinnollisilla käytännöillä. Turvaton tuotoksen käsittely (LLM05:2025) torjutaan tulosteen koodauksella (OWASP Foundation </w:t>
       </w:r>
-      <w:proofErr w:type="gramStart"/>
-      <w:r>
-        <w:rPr>
-          <w:rFonts w:ascii="Google Sans Text" w:eastAsia="Google Sans Text" w:hAnsi="Google Sans Text" w:cs="Google Sans Text"/>
-          <w:color w:val="1F1F1F"/>
-        </w:rPr>
-        <w:t>2025c</w:t>
-      </w:r>
-      <w:proofErr w:type="gramEnd"/>
-      <w:r>
-        <w:rPr>
-          <w:rFonts w:ascii="Google Sans Text" w:eastAsia="Google Sans Text" w:hAnsi="Google Sans Text" w:cs="Google Sans Text"/>
-          <w:color w:val="1F1F1F"/>
-        </w:rPr>
-        <w:t xml:space="preserve">). Toimitusketjun haavoittuvuuksia (LLM03:2025) hallitaan </w:t>
+      <w:r>
+        <w:rPr>
+          <w:rFonts w:ascii="Google Sans Text" w:eastAsia="Google Sans Text" w:hAnsi="Google Sans Text" w:cs="Google Sans Text"/>
+          <w:color w:val="1F1F1F"/>
+        </w:rPr>
+        <w:lastRenderedPageBreak/>
+        <w:t xml:space="preserve">2025c). Toimitusketjun haavoittuvuuksia (LLM03:2025) hallitaan </w:t>
       </w:r>
       <w:proofErr w:type="spellStart"/>
       <w:r>
@@ -14782,7 +15334,14 @@
           <w:rFonts w:ascii="Google Sans Text" w:eastAsia="Google Sans Text" w:hAnsi="Google Sans Text" w:cs="Google Sans Text"/>
           <w:color w:val="1F1F1F"/>
         </w:rPr>
-        <w:t xml:space="preserve"> 2025).</w:t>
+        <w:t xml:space="preserve"> 2025)</w:t>
+      </w:r>
+      <w:r>
+        <w:rPr>
+          <w:rFonts w:ascii="Google Sans Text" w:eastAsia="Google Sans Text" w:hAnsi="Google Sans Text" w:cs="Google Sans Text"/>
+          <w:color w:val="1F1F1F"/>
+        </w:rPr>
+        <w:t>.</w:t>
       </w:r>
     </w:p>
     <w:sectPr>
@@ -17550,6 +18109,119 @@
     </w:lvl>
   </w:abstractNum>
   <w:abstractNum w:abstractNumId="15" w15:restartNumberingAfterBreak="0">
+    <w:nsid w:val="29A55A80"/>
+    <w:multiLevelType w:val="hybridMultilevel"/>
+    <w:tmpl w:val="7082B972"/>
+    <w:lvl w:ilvl="0" w:tplc="040B0001">
+      <w:start w:val="1"/>
+      <w:numFmt w:val="bullet"/>
+      <w:lvlText w:val=""/>
+      <w:lvlJc w:val="left"/>
+      <w:pPr>
+        <w:ind w:left="720" w:hanging="360"/>
+      </w:pPr>
+      <w:rPr>
+        <w:rFonts w:ascii="Symbol" w:hAnsi="Symbol" w:hint="default"/>
+      </w:rPr>
+    </w:lvl>
+    <w:lvl w:ilvl="1" w:tplc="040B0003" w:tentative="1">
+      <w:start w:val="1"/>
+      <w:numFmt w:val="bullet"/>
+      <w:lvlText w:val="o"/>
+      <w:lvlJc w:val="left"/>
+      <w:pPr>
+        <w:ind w:left="1440" w:hanging="360"/>
+      </w:pPr>
+      <w:rPr>
+        <w:rFonts w:ascii="Courier New" w:hAnsi="Courier New" w:cs="Courier New" w:hint="default"/>
+      </w:rPr>
+    </w:lvl>
+    <w:lvl w:ilvl="2" w:tplc="040B0005" w:tentative="1">
+      <w:start w:val="1"/>
+      <w:numFmt w:val="bullet"/>
+      <w:lvlText w:val=""/>
+      <w:lvlJc w:val="left"/>
+      <w:pPr>
+        <w:ind w:left="2160" w:hanging="360"/>
+      </w:pPr>
+      <w:rPr>
+        <w:rFonts w:ascii="Wingdings" w:hAnsi="Wingdings" w:hint="default"/>
+      </w:rPr>
+    </w:lvl>
+    <w:lvl w:ilvl="3" w:tplc="040B0001" w:tentative="1">
+      <w:start w:val="1"/>
+      <w:numFmt w:val="bullet"/>
+      <w:lvlText w:val=""/>
+      <w:lvlJc w:val="left"/>
+      <w:pPr>
+        <w:ind w:left="2880" w:hanging="360"/>
+      </w:pPr>
+      <w:rPr>
+        <w:rFonts w:ascii="Symbol" w:hAnsi="Symbol" w:hint="default"/>
+      </w:rPr>
+    </w:lvl>
+    <w:lvl w:ilvl="4" w:tplc="040B0003" w:tentative="1">
+      <w:start w:val="1"/>
+      <w:numFmt w:val="bullet"/>
+      <w:lvlText w:val="o"/>
+      <w:lvlJc w:val="left"/>
+      <w:pPr>
+        <w:ind w:left="3600" w:hanging="360"/>
+      </w:pPr>
+      <w:rPr>
+        <w:rFonts w:ascii="Courier New" w:hAnsi="Courier New" w:cs="Courier New" w:hint="default"/>
+      </w:rPr>
+    </w:lvl>
+    <w:lvl w:ilvl="5" w:tplc="040B0005" w:tentative="1">
+      <w:start w:val="1"/>
+      <w:numFmt w:val="bullet"/>
+      <w:lvlText w:val=""/>
+      <w:lvlJc w:val="left"/>
+      <w:pPr>
+        <w:ind w:left="4320" w:hanging="360"/>
+      </w:pPr>
+      <w:rPr>
+        <w:rFonts w:ascii="Wingdings" w:hAnsi="Wingdings" w:hint="default"/>
+      </w:rPr>
+    </w:lvl>
+    <w:lvl w:ilvl="6" w:tplc="040B0001" w:tentative="1">
+      <w:start w:val="1"/>
+      <w:numFmt w:val="bullet"/>
+      <w:lvlText w:val=""/>
+      <w:lvlJc w:val="left"/>
+      <w:pPr>
+        <w:ind w:left="5040" w:hanging="360"/>
+      </w:pPr>
+      <w:rPr>
+        <w:rFonts w:ascii="Symbol" w:hAnsi="Symbol" w:hint="default"/>
+      </w:rPr>
+    </w:lvl>
+    <w:lvl w:ilvl="7" w:tplc="040B0003" w:tentative="1">
+      <w:start w:val="1"/>
+      <w:numFmt w:val="bullet"/>
+      <w:lvlText w:val="o"/>
+      <w:lvlJc w:val="left"/>
+      <w:pPr>
+        <w:ind w:left="5760" w:hanging="360"/>
+      </w:pPr>
+      <w:rPr>
+        <w:rFonts w:ascii="Courier New" w:hAnsi="Courier New" w:cs="Courier New" w:hint="default"/>
+      </w:rPr>
+    </w:lvl>
+    <w:lvl w:ilvl="8" w:tplc="040B0005" w:tentative="1">
+      <w:start w:val="1"/>
+      <w:numFmt w:val="bullet"/>
+      <w:lvlText w:val=""/>
+      <w:lvlJc w:val="left"/>
+      <w:pPr>
+        <w:ind w:left="6480" w:hanging="360"/>
+      </w:pPr>
+      <w:rPr>
+        <w:rFonts w:ascii="Wingdings" w:hAnsi="Wingdings" w:hint="default"/>
+      </w:rPr>
+    </w:lvl>
+  </w:abstractNum>
+  <w:abstractNum w:abstractNumId="16" w15:restartNumberingAfterBreak="0">
     <w:nsid w:val="29C365CF"/>
     <w:multiLevelType w:val="multilevel"/>
     <w:tmpl w:val="00425630"/>
@@ -17698,7 +18370,7 @@
       </w:rPr>
     </w:lvl>
   </w:abstractNum>
-  <w:abstractNum w:abstractNumId="16" w15:restartNumberingAfterBreak="0">
+  <w:abstractNum w:abstractNumId="17" w15:restartNumberingAfterBreak="0">
     <w:nsid w:val="2AC7524A"/>
     <w:multiLevelType w:val="multilevel"/>
     <w:tmpl w:val="409059E2"/>
@@ -17919,7 +18591,7 @@
       </w:rPr>
     </w:lvl>
   </w:abstractNum>
-  <w:abstractNum w:abstractNumId="17" w15:restartNumberingAfterBreak="0">
+  <w:abstractNum w:abstractNumId="18" w15:restartNumberingAfterBreak="0">
     <w:nsid w:val="2BA93E85"/>
     <w:multiLevelType w:val="multilevel"/>
     <w:tmpl w:val="445AC3CE"/>
@@ -18032,7 +18704,7 @@
       </w:pPr>
     </w:lvl>
   </w:abstractNum>
-  <w:abstractNum w:abstractNumId="18" w15:restartNumberingAfterBreak="0">
+  <w:abstractNum w:abstractNumId="19" w15:restartNumberingAfterBreak="0">
     <w:nsid w:val="34C238AC"/>
     <w:multiLevelType w:val="multilevel"/>
     <w:tmpl w:val="BAC22B36"/>
@@ -18181,7 +18853,7 @@
       </w:rPr>
     </w:lvl>
   </w:abstractNum>
-  <w:abstractNum w:abstractNumId="19" w15:restartNumberingAfterBreak="0">
+  <w:abstractNum w:abstractNumId="20" w15:restartNumberingAfterBreak="0">
     <w:nsid w:val="3500797B"/>
     <w:multiLevelType w:val="multilevel"/>
     <w:tmpl w:val="7332C36E"/>
@@ -18402,7 +19074,7 @@
       </w:rPr>
     </w:lvl>
   </w:abstractNum>
-  <w:abstractNum w:abstractNumId="20" w15:restartNumberingAfterBreak="0">
+  <w:abstractNum w:abstractNumId="21" w15:restartNumberingAfterBreak="0">
     <w:nsid w:val="35901E54"/>
     <w:multiLevelType w:val="multilevel"/>
     <w:tmpl w:val="44E0A87E"/>
@@ -18623,7 +19295,7 @@
       </w:rPr>
     </w:lvl>
   </w:abstractNum>
-  <w:abstractNum w:abstractNumId="21" w15:restartNumberingAfterBreak="0">
+  <w:abstractNum w:abstractNumId="22" w15:restartNumberingAfterBreak="0">
     <w:nsid w:val="3B492E9F"/>
     <w:multiLevelType w:val="multilevel"/>
     <w:tmpl w:val="A630F074"/>
@@ -18844,7 +19516,7 @@
       </w:rPr>
     </w:lvl>
   </w:abstractNum>
-  <w:abstractNum w:abstractNumId="22" w15:restartNumberingAfterBreak="0">
+  <w:abstractNum w:abstractNumId="23" w15:restartNumberingAfterBreak="0">
     <w:nsid w:val="40E852FB"/>
     <w:multiLevelType w:val="multilevel"/>
     <w:tmpl w:val="632894F0"/>
@@ -19065,7 +19737,7 @@
       </w:rPr>
     </w:lvl>
   </w:abstractNum>
-  <w:abstractNum w:abstractNumId="23" w15:restartNumberingAfterBreak="0">
+  <w:abstractNum w:abstractNumId="24" w15:restartNumberingAfterBreak="0">
     <w:nsid w:val="42784343"/>
     <w:multiLevelType w:val="multilevel"/>
     <w:tmpl w:val="91168B26"/>
@@ -19214,7 +19886,7 @@
       </w:rPr>
     </w:lvl>
   </w:abstractNum>
-  <w:abstractNum w:abstractNumId="24" w15:restartNumberingAfterBreak="0">
+  <w:abstractNum w:abstractNumId="25" w15:restartNumberingAfterBreak="0">
     <w:nsid w:val="454E0DAB"/>
     <w:multiLevelType w:val="multilevel"/>
     <w:tmpl w:val="3C363236"/>
@@ -19327,7 +19999,7 @@
       </w:pPr>
     </w:lvl>
   </w:abstractNum>
-  <w:abstractNum w:abstractNumId="25" w15:restartNumberingAfterBreak="0">
+  <w:abstractNum w:abstractNumId="26" w15:restartNumberingAfterBreak="0">
     <w:nsid w:val="47D02BAE"/>
     <w:multiLevelType w:val="multilevel"/>
     <w:tmpl w:val="E542DA22"/>
@@ -19548,7 +20220,7 @@
       </w:rPr>
     </w:lvl>
   </w:abstractNum>
-  <w:abstractNum w:abstractNumId="26" w15:restartNumberingAfterBreak="0">
+  <w:abstractNum w:abstractNumId="27" w15:restartNumberingAfterBreak="0">
     <w:nsid w:val="4A2A5FEA"/>
     <w:multiLevelType w:val="multilevel"/>
     <w:tmpl w:val="B58C6B46"/>
@@ -19697,7 +20369,7 @@
       </w:rPr>
     </w:lvl>
   </w:abstractNum>
-  <w:abstractNum w:abstractNumId="27" w15:restartNumberingAfterBreak="0">
+  <w:abstractNum w:abstractNumId="28" w15:restartNumberingAfterBreak="0">
     <w:nsid w:val="4A887D46"/>
     <w:multiLevelType w:val="multilevel"/>
     <w:tmpl w:val="669CD444"/>
@@ -19918,7 +20590,7 @@
       </w:rPr>
     </w:lvl>
   </w:abstractNum>
-  <w:abstractNum w:abstractNumId="28" w15:restartNumberingAfterBreak="0">
+  <w:abstractNum w:abstractNumId="29" w15:restartNumberingAfterBreak="0">
     <w:nsid w:val="4E805757"/>
     <w:multiLevelType w:val="multilevel"/>
     <w:tmpl w:val="CD163A3E"/>
@@ -20139,7 +20811,7 @@
       </w:rPr>
     </w:lvl>
   </w:abstractNum>
-  <w:abstractNum w:abstractNumId="29" w15:restartNumberingAfterBreak="0">
+  <w:abstractNum w:abstractNumId="30" w15:restartNumberingAfterBreak="0">
     <w:nsid w:val="527D4CD7"/>
     <w:multiLevelType w:val="multilevel"/>
     <w:tmpl w:val="1C901760"/>
@@ -20360,7 +21032,7 @@
       </w:rPr>
     </w:lvl>
   </w:abstractNum>
-  <w:abstractNum w:abstractNumId="30" w15:restartNumberingAfterBreak="0">
+  <w:abstractNum w:abstractNumId="31" w15:restartNumberingAfterBreak="0">
     <w:nsid w:val="56BC2D98"/>
     <w:multiLevelType w:val="multilevel"/>
     <w:tmpl w:val="DDA241C4"/>
@@ -20581,7 +21253,7 @@
       </w:rPr>
     </w:lvl>
   </w:abstractNum>
-  <w:abstractNum w:abstractNumId="31" w15:restartNumberingAfterBreak="0">
+  <w:abstractNum w:abstractNumId="32" w15:restartNumberingAfterBreak="0">
     <w:nsid w:val="574A7306"/>
     <w:multiLevelType w:val="multilevel"/>
     <w:tmpl w:val="E78EC686"/>
@@ -20802,7 +21474,7 @@
       </w:rPr>
     </w:lvl>
   </w:abstractNum>
-  <w:abstractNum w:abstractNumId="32" w15:restartNumberingAfterBreak="0">
+  <w:abstractNum w:abstractNumId="33" w15:restartNumberingAfterBreak="0">
     <w:nsid w:val="5852100C"/>
     <w:multiLevelType w:val="multilevel"/>
     <w:tmpl w:val="8EF23B8E"/>
@@ -21023,7 +21695,7 @@
       </w:rPr>
     </w:lvl>
   </w:abstractNum>
-  <w:abstractNum w:abstractNumId="33" w15:restartNumberingAfterBreak="0">
+  <w:abstractNum w:abstractNumId="34" w15:restartNumberingAfterBreak="0">
     <w:nsid w:val="58B01C9C"/>
     <w:multiLevelType w:val="multilevel"/>
     <w:tmpl w:val="892CEFD6"/>
@@ -21172,7 +21844,120 @@
       </w:rPr>
     </w:lvl>
   </w:abstractNum>
-  <w:abstractNum w:abstractNumId="34" w15:restartNumberingAfterBreak="0">
+  <w:abstractNum w:abstractNumId="35" w15:restartNumberingAfterBreak="0">
+    <w:nsid w:val="5C434291"/>
+    <w:multiLevelType w:val="hybridMultilevel"/>
+    <w:tmpl w:val="021412FA"/>
+    <w:lvl w:ilvl="0" w:tplc="040B0001">
+      <w:start w:val="1"/>
+      <w:numFmt w:val="bullet"/>
+      <w:lvlText w:val=""/>
+      <w:lvlJc w:val="left"/>
+      <w:pPr>
+        <w:ind w:left="720" w:hanging="360"/>
+      </w:pPr>
+      <w:rPr>
+        <w:rFonts w:ascii="Symbol" w:hAnsi="Symbol" w:hint="default"/>
+      </w:rPr>
+    </w:lvl>
+    <w:lvl w:ilvl="1" w:tplc="040B0003" w:tentative="1">
+      <w:start w:val="1"/>
+      <w:numFmt w:val="bullet"/>
+      <w:lvlText w:val="o"/>
+      <w:lvlJc w:val="left"/>
+      <w:pPr>
+        <w:ind w:left="1440" w:hanging="360"/>
+      </w:pPr>
+      <w:rPr>
+        <w:rFonts w:ascii="Courier New" w:hAnsi="Courier New" w:cs="Courier New" w:hint="default"/>
+      </w:rPr>
+    </w:lvl>
+    <w:lvl w:ilvl="2" w:tplc="040B0005" w:tentative="1">
+      <w:start w:val="1"/>
+      <w:numFmt w:val="bullet"/>
+      <w:lvlText w:val=""/>
+      <w:lvlJc w:val="left"/>
+      <w:pPr>
+        <w:ind w:left="2160" w:hanging="360"/>
+      </w:pPr>
+      <w:rPr>
+        <w:rFonts w:ascii="Wingdings" w:hAnsi="Wingdings" w:hint="default"/>
+      </w:rPr>
+    </w:lvl>
+    <w:lvl w:ilvl="3" w:tplc="040B0001" w:tentative="1">
+      <w:start w:val="1"/>
+      <w:numFmt w:val="bullet"/>
+      <w:lvlText w:val=""/>
+      <w:lvlJc w:val="left"/>
+      <w:pPr>
+        <w:ind w:left="2880" w:hanging="360"/>
+      </w:pPr>
+      <w:rPr>
+        <w:rFonts w:ascii="Symbol" w:hAnsi="Symbol" w:hint="default"/>
+      </w:rPr>
+    </w:lvl>
+    <w:lvl w:ilvl="4" w:tplc="040B0003" w:tentative="1">
+      <w:start w:val="1"/>
+      <w:numFmt w:val="bullet"/>
+      <w:lvlText w:val="o"/>
+      <w:lvlJc w:val="left"/>
+      <w:pPr>
+        <w:ind w:left="3600" w:hanging="360"/>
+      </w:pPr>
+      <w:rPr>
+        <w:rFonts w:ascii="Courier New" w:hAnsi="Courier New" w:cs="Courier New" w:hint="default"/>
+      </w:rPr>
+    </w:lvl>
+    <w:lvl w:ilvl="5" w:tplc="040B0005" w:tentative="1">
+      <w:start w:val="1"/>
+      <w:numFmt w:val="bullet"/>
+      <w:lvlText w:val=""/>
+      <w:lvlJc w:val="left"/>
+      <w:pPr>
+        <w:ind w:left="4320" w:hanging="360"/>
+      </w:pPr>
+      <w:rPr>
+        <w:rFonts w:ascii="Wingdings" w:hAnsi="Wingdings" w:hint="default"/>
+      </w:rPr>
+    </w:lvl>
+    <w:lvl w:ilvl="6" w:tplc="040B0001" w:tentative="1">
+      <w:start w:val="1"/>
+      <w:numFmt w:val="bullet"/>
+      <w:lvlText w:val=""/>
+      <w:lvlJc w:val="left"/>
+      <w:pPr>
+        <w:ind w:left="5040" w:hanging="360"/>
+      </w:pPr>
+      <w:rPr>
+        <w:rFonts w:ascii="Symbol" w:hAnsi="Symbol" w:hint="default"/>
+      </w:rPr>
+    </w:lvl>
+    <w:lvl w:ilvl="7" w:tplc="040B0003" w:tentative="1">
+      <w:start w:val="1"/>
+      <w:numFmt w:val="bullet"/>
+      <w:lvlText w:val="o"/>
+      <w:lvlJc w:val="left"/>
+      <w:pPr>
+        <w:ind w:left="5760" w:hanging="360"/>
+      </w:pPr>
+      <w:rPr>
+        <w:rFonts w:ascii="Courier New" w:hAnsi="Courier New" w:cs="Courier New" w:hint="default"/>
+      </w:rPr>
+    </w:lvl>
+    <w:lvl w:ilvl="8" w:tplc="040B0005" w:tentative="1">
+      <w:start w:val="1"/>
+      <w:numFmt w:val="bullet"/>
+      <w:lvlText w:val=""/>
+      <w:lvlJc w:val="left"/>
+      <w:pPr>
+        <w:ind w:left="6480" w:hanging="360"/>
+      </w:pPr>
+      <w:rPr>
+        <w:rFonts w:ascii="Wingdings" w:hAnsi="Wingdings" w:hint="default"/>
+      </w:rPr>
+    </w:lvl>
+  </w:abstractNum>
+  <w:abstractNum w:abstractNumId="36" w15:restartNumberingAfterBreak="0">
     <w:nsid w:val="5D485772"/>
     <w:multiLevelType w:val="multilevel"/>
     <w:tmpl w:val="FC107E9E"/>
@@ -21393,7 +22178,7 @@
       </w:rPr>
     </w:lvl>
   </w:abstractNum>
-  <w:abstractNum w:abstractNumId="35" w15:restartNumberingAfterBreak="0">
+  <w:abstractNum w:abstractNumId="37" w15:restartNumberingAfterBreak="0">
     <w:nsid w:val="5D832B22"/>
     <w:multiLevelType w:val="multilevel"/>
     <w:tmpl w:val="FD7C4520"/>
@@ -21614,7 +22399,7 @@
       </w:rPr>
     </w:lvl>
   </w:abstractNum>
-  <w:abstractNum w:abstractNumId="36" w15:restartNumberingAfterBreak="0">
+  <w:abstractNum w:abstractNumId="38" w15:restartNumberingAfterBreak="0">
     <w:nsid w:val="5F3540E3"/>
     <w:multiLevelType w:val="multilevel"/>
     <w:tmpl w:val="F732DBE0"/>
@@ -21835,7 +22620,7 @@
       </w:rPr>
     </w:lvl>
   </w:abstractNum>
-  <w:abstractNum w:abstractNumId="37" w15:restartNumberingAfterBreak="0">
+  <w:abstractNum w:abstractNumId="39" w15:restartNumberingAfterBreak="0">
     <w:nsid w:val="69B87CF8"/>
     <w:multiLevelType w:val="multilevel"/>
     <w:tmpl w:val="24C4E176"/>
@@ -21948,7 +22733,7 @@
       </w:pPr>
     </w:lvl>
   </w:abstractNum>
-  <w:abstractNum w:abstractNumId="38" w15:restartNumberingAfterBreak="0">
+  <w:abstractNum w:abstractNumId="40" w15:restartNumberingAfterBreak="0">
     <w:nsid w:val="6B2079FE"/>
     <w:multiLevelType w:val="multilevel"/>
     <w:tmpl w:val="B714324C"/>
@@ -22169,7 +22954,7 @@
       </w:rPr>
     </w:lvl>
   </w:abstractNum>
-  <w:abstractNum w:abstractNumId="39" w15:restartNumberingAfterBreak="0">
+  <w:abstractNum w:abstractNumId="41" w15:restartNumberingAfterBreak="0">
     <w:nsid w:val="6D065539"/>
     <w:multiLevelType w:val="multilevel"/>
     <w:tmpl w:val="6E703DCA"/>
@@ -22390,7 +23175,7 @@
       </w:rPr>
     </w:lvl>
   </w:abstractNum>
-  <w:abstractNum w:abstractNumId="40" w15:restartNumberingAfterBreak="0">
+  <w:abstractNum w:abstractNumId="42" w15:restartNumberingAfterBreak="0">
     <w:nsid w:val="72FD17DE"/>
     <w:multiLevelType w:val="multilevel"/>
     <w:tmpl w:val="89108AF0"/>
@@ -22503,7 +23288,7 @@
       </w:rPr>
     </w:lvl>
   </w:abstractNum>
-  <w:abstractNum w:abstractNumId="41" w15:restartNumberingAfterBreak="0">
+  <w:abstractNum w:abstractNumId="43" w15:restartNumberingAfterBreak="0">
     <w:nsid w:val="7527344D"/>
     <w:multiLevelType w:val="multilevel"/>
     <w:tmpl w:val="3586BAB8"/>
@@ -22652,7 +23437,7 @@
       </w:rPr>
     </w:lvl>
   </w:abstractNum>
-  <w:abstractNum w:abstractNumId="42" w15:restartNumberingAfterBreak="0">
+  <w:abstractNum w:abstractNumId="44" w15:restartNumberingAfterBreak="0">
     <w:nsid w:val="75EE7AA8"/>
     <w:multiLevelType w:val="multilevel"/>
     <w:tmpl w:val="9D3E018A"/>
@@ -22873,7 +23658,7 @@
       </w:rPr>
     </w:lvl>
   </w:abstractNum>
-  <w:abstractNum w:abstractNumId="43" w15:restartNumberingAfterBreak="0">
+  <w:abstractNum w:abstractNumId="45" w15:restartNumberingAfterBreak="0">
     <w:nsid w:val="780363F5"/>
     <w:multiLevelType w:val="multilevel"/>
     <w:tmpl w:val="0EE2380A"/>
@@ -23094,7 +23879,7 @@
       </w:rPr>
     </w:lvl>
   </w:abstractNum>
-  <w:abstractNum w:abstractNumId="44" w15:restartNumberingAfterBreak="0">
+  <w:abstractNum w:abstractNumId="46" w15:restartNumberingAfterBreak="0">
     <w:nsid w:val="7ED32B1B"/>
     <w:multiLevelType w:val="multilevel"/>
     <w:tmpl w:val="A7F263D6"/>
@@ -23315,7 +24100,7 @@
       </w:rPr>
     </w:lvl>
   </w:abstractNum>
-  <w:abstractNum w:abstractNumId="45" w15:restartNumberingAfterBreak="0">
+  <w:abstractNum w:abstractNumId="47" w15:restartNumberingAfterBreak="0">
     <w:nsid w:val="7EE607DE"/>
     <w:multiLevelType w:val="multilevel"/>
     <w:tmpl w:val="1194CF84"/>
@@ -23536,7 +24321,7 @@
       </w:rPr>
     </w:lvl>
   </w:abstractNum>
-  <w:abstractNum w:abstractNumId="46" w15:restartNumberingAfterBreak="0">
+  <w:abstractNum w:abstractNumId="48" w15:restartNumberingAfterBreak="0">
     <w:nsid w:val="7F1D3D6B"/>
     <w:multiLevelType w:val="multilevel"/>
     <w:tmpl w:val="FE9C57A4"/>
@@ -23689,28 +24474,28 @@
     <w:abstractNumId w:val="7"/>
   </w:num>
   <w:num w:numId="2" w16cid:durableId="821238128">
-    <w:abstractNumId w:val="32"/>
+    <w:abstractNumId w:val="33"/>
   </w:num>
   <w:num w:numId="3" w16cid:durableId="417602844">
-    <w:abstractNumId w:val="38"/>
+    <w:abstractNumId w:val="40"/>
   </w:num>
   <w:num w:numId="4" w16cid:durableId="571694853">
-    <w:abstractNumId w:val="16"/>
+    <w:abstractNumId w:val="17"/>
   </w:num>
   <w:num w:numId="5" w16cid:durableId="497693598">
-    <w:abstractNumId w:val="22"/>
+    <w:abstractNumId w:val="23"/>
   </w:num>
   <w:num w:numId="6" w16cid:durableId="2006007483">
-    <w:abstractNumId w:val="39"/>
+    <w:abstractNumId w:val="41"/>
   </w:num>
   <w:num w:numId="7" w16cid:durableId="122772121">
     <w:abstractNumId w:val="11"/>
   </w:num>
   <w:num w:numId="8" w16cid:durableId="1672948414">
-    <w:abstractNumId w:val="36"/>
+    <w:abstractNumId w:val="38"/>
   </w:num>
   <w:num w:numId="9" w16cid:durableId="1419641517">
-    <w:abstractNumId w:val="29"/>
+    <w:abstractNumId w:val="30"/>
   </w:num>
   <w:num w:numId="10" w16cid:durableId="1790473377">
     <w:abstractNumId w:val="6"/>
@@ -23719,112 +24504,118 @@
     <w:abstractNumId w:val="3"/>
   </w:num>
   <w:num w:numId="12" w16cid:durableId="1142425663">
-    <w:abstractNumId w:val="25"/>
+    <w:abstractNumId w:val="26"/>
   </w:num>
   <w:num w:numId="13" w16cid:durableId="1461418827">
-    <w:abstractNumId w:val="43"/>
+    <w:abstractNumId w:val="45"/>
   </w:num>
   <w:num w:numId="14" w16cid:durableId="590625585">
-    <w:abstractNumId w:val="40"/>
+    <w:abstractNumId w:val="42"/>
   </w:num>
   <w:num w:numId="15" w16cid:durableId="1969319015">
     <w:abstractNumId w:val="14"/>
   </w:num>
   <w:num w:numId="16" w16cid:durableId="823159932">
-    <w:abstractNumId w:val="23"/>
+    <w:abstractNumId w:val="24"/>
   </w:num>
   <w:num w:numId="17" w16cid:durableId="1487740281">
-    <w:abstractNumId w:val="42"/>
+    <w:abstractNumId w:val="44"/>
   </w:num>
   <w:num w:numId="18" w16cid:durableId="344678147">
     <w:abstractNumId w:val="1"/>
   </w:num>
   <w:num w:numId="19" w16cid:durableId="1542286810">
-    <w:abstractNumId w:val="30"/>
+    <w:abstractNumId w:val="31"/>
   </w:num>
   <w:num w:numId="20" w16cid:durableId="1999578978">
     <w:abstractNumId w:val="0"/>
   </w:num>
   <w:num w:numId="21" w16cid:durableId="544483621">
-    <w:abstractNumId w:val="27"/>
+    <w:abstractNumId w:val="28"/>
   </w:num>
   <w:num w:numId="22" w16cid:durableId="1111163356">
     <w:abstractNumId w:val="2"/>
   </w:num>
   <w:num w:numId="23" w16cid:durableId="924874664">
-    <w:abstractNumId w:val="20"/>
+    <w:abstractNumId w:val="21"/>
   </w:num>
   <w:num w:numId="24" w16cid:durableId="359203445">
     <w:abstractNumId w:val="8"/>
   </w:num>
   <w:num w:numId="25" w16cid:durableId="208689680">
-    <w:abstractNumId w:val="45"/>
+    <w:abstractNumId w:val="47"/>
   </w:num>
   <w:num w:numId="26" w16cid:durableId="1015420903">
-    <w:abstractNumId w:val="19"/>
+    <w:abstractNumId w:val="20"/>
   </w:num>
   <w:num w:numId="27" w16cid:durableId="31538885">
-    <w:abstractNumId w:val="31"/>
+    <w:abstractNumId w:val="32"/>
   </w:num>
   <w:num w:numId="28" w16cid:durableId="1737626172">
-    <w:abstractNumId w:val="35"/>
+    <w:abstractNumId w:val="37"/>
   </w:num>
   <w:num w:numId="29" w16cid:durableId="1743602719">
-    <w:abstractNumId w:val="44"/>
+    <w:abstractNumId w:val="46"/>
   </w:num>
   <w:num w:numId="30" w16cid:durableId="1904945612">
-    <w:abstractNumId w:val="28"/>
+    <w:abstractNumId w:val="29"/>
   </w:num>
   <w:num w:numId="31" w16cid:durableId="1120757864">
     <w:abstractNumId w:val="5"/>
   </w:num>
   <w:num w:numId="32" w16cid:durableId="633415199">
-    <w:abstractNumId w:val="34"/>
+    <w:abstractNumId w:val="36"/>
   </w:num>
   <w:num w:numId="33" w16cid:durableId="798302902">
-    <w:abstractNumId w:val="21"/>
+    <w:abstractNumId w:val="22"/>
   </w:num>
   <w:num w:numId="34" w16cid:durableId="604580761">
     <w:abstractNumId w:val="12"/>
   </w:num>
   <w:num w:numId="35" w16cid:durableId="541596826">
-    <w:abstractNumId w:val="17"/>
+    <w:abstractNumId w:val="18"/>
   </w:num>
   <w:num w:numId="36" w16cid:durableId="1778987999">
     <w:abstractNumId w:val="13"/>
   </w:num>
   <w:num w:numId="37" w16cid:durableId="1568690195">
-    <w:abstractNumId w:val="24"/>
+    <w:abstractNumId w:val="25"/>
   </w:num>
   <w:num w:numId="38" w16cid:durableId="597563245">
     <w:abstractNumId w:val="10"/>
   </w:num>
   <w:num w:numId="39" w16cid:durableId="418984859">
-    <w:abstractNumId w:val="37"/>
+    <w:abstractNumId w:val="39"/>
   </w:num>
   <w:num w:numId="40" w16cid:durableId="1446459543">
-    <w:abstractNumId w:val="41"/>
+    <w:abstractNumId w:val="43"/>
   </w:num>
   <w:num w:numId="41" w16cid:durableId="1856990521">
     <w:abstractNumId w:val="9"/>
   </w:num>
   <w:num w:numId="42" w16cid:durableId="1141387399">
-    <w:abstractNumId w:val="46"/>
+    <w:abstractNumId w:val="48"/>
   </w:num>
   <w:num w:numId="43" w16cid:durableId="1285038079">
-    <w:abstractNumId w:val="33"/>
+    <w:abstractNumId w:val="34"/>
   </w:num>
   <w:num w:numId="44" w16cid:durableId="1849254286">
-    <w:abstractNumId w:val="15"/>
+    <w:abstractNumId w:val="16"/>
   </w:num>
   <w:num w:numId="45" w16cid:durableId="1563982743">
-    <w:abstractNumId w:val="26"/>
+    <w:abstractNumId w:val="27"/>
   </w:num>
   <w:num w:numId="46" w16cid:durableId="443772635">
-    <w:abstractNumId w:val="18"/>
+    <w:abstractNumId w:val="19"/>
   </w:num>
   <w:num w:numId="47" w16cid:durableId="1436050495">
     <w:abstractNumId w:val="4"/>
+  </w:num>
+  <w:num w:numId="48" w16cid:durableId="2025327888">
+    <w:abstractNumId w:val="35"/>
+  </w:num>
+  <w:num w:numId="49" w16cid:durableId="196167875">
+    <w:abstractNumId w:val="15"/>
   </w:num>
   <w:numIdMacAtCleanup w:val="41"/>
 </w:numbering>
@@ -24387,6 +25178,7 @@
   <w:style w:type="character" w:default="1" w:styleId="Kappaleenoletusfontti">
     <w:name w:val="Default Paragraph Font"/>
     <w:uiPriority w:val="1"/>
+    <w:semiHidden/>
     <w:unhideWhenUsed/>
   </w:style>
   <w:style w:type="table" w:default="1" w:styleId="Normaalitaulukko">

</xml_diff>